<commit_message>
non ho fatto un cazzo
</commit_message>
<xml_diff>
--- a/bd/leggimi.docx
+++ b/bd/leggimi.docx
@@ -22,21 +22,43 @@
           <w:lang w:val="it-IT"/>
         </w:rPr>
       </w:r>
-    </w:p>
-    <w:p>
-      <w:pPr>
-        <w:pBdr/>
-        <w:spacing/>
-        <w:ind/>
-        <w:rPr>
-          <w:lang w:val="it-IT"/>
-        </w:rPr>
-      </w:pPr>
       <w:r>
         <w:rPr>
           <w:lang w:val="it-IT"/>
         </w:rPr>
-        <w:t xml:space="preserve">Lo schema concettuale era il seguente:</w:t>
+      </w:r>
+    </w:p>
+    <w:p>
+      <w:pPr>
+        <w:pBdr/>
+        <w:spacing/>
+        <w:ind/>
+        <w:rPr>
+          <w:lang w:val="it-IT"/>
+        </w:rPr>
+      </w:pPr>
+      <w:r>
+        <w:rPr>
+          <w:lang w:val="it-IT"/>
+        </w:rPr>
+        <w:t xml:space="preserve">Lo schema concettuale </w:t>
+      </w:r>
+      <w:r>
+        <w:rPr>
+          <w:lang w:val="en-US"/>
+        </w:rPr>
+        <w:t xml:space="preserve">e’</w:t>
+      </w:r>
+      <w:r>
+        <w:rPr>
+          <w:lang w:val="it-IT"/>
+        </w:rPr>
+        <w:t xml:space="preserve"> il seguente:</w:t>
+      </w:r>
+      <w:r>
+        <w:rPr>
+          <w:lang w:val="it-IT"/>
+        </w:rPr>
       </w:r>
       <w:r>
         <w:rPr>
@@ -149,6 +171,12 @@
           <w:lang w:val="it-IT"/>
         </w:rPr>
       </w:r>
+      <w:r>
+        <w:rPr>
+          <w:highlight w:val="none"/>
+          <w:lang w:val="it-IT"/>
+        </w:rPr>
+      </w:r>
     </w:p>
     <w:p>
       <w:pPr>
@@ -156,7 +184,8 @@
         <w:spacing/>
         <w:ind/>
         <w:rPr>
-          <w:lang w:val="it-IT"/>
+          <w:highlight w:val="none"/>
+          <w:lang w:val="en-US"/>
         </w:rPr>
       </w:pPr>
       <w:r>
@@ -183,13 +212,193 @@
       <w:r>
         <w:rPr>
           <w:highlight w:val="none"/>
+          <w:lang w:val="en-US"/>
+        </w:rPr>
+      </w:r>
+      <w:r>
+        <w:rPr>
+          <w:lang w:val="it-IT"/>
+        </w:rPr>
+      </w:r>
+    </w:p>
+    <w:p>
+      <w:pPr>
+        <w:pBdr/>
+        <w:spacing/>
+        <w:ind/>
+        <w:rPr>
+          <w:lang w:val="it-IT"/>
+        </w:rPr>
+      </w:pPr>
+      <w:r>
+        <w:rPr>
+          <w:lang w:val="it-IT"/>
+        </w:rPr>
+      </w:r>
+      <w:r>
+        <w:rPr>
+          <w:lang w:val="it-IT"/>
+        </w:rPr>
+      </w:r>
+      <w:r>
+        <w:rPr>
+          <w:lang w:val="it-IT"/>
+        </w:rPr>
+      </w:r>
+    </w:p>
+    <w:p>
+      <w:pPr>
+        <w:pBdr/>
+        <w:spacing/>
+        <w:ind/>
+        <w:rPr>
+          <w:lang w:val="it-IT"/>
+        </w:rPr>
+      </w:pPr>
+      <w:r>
+        <w:rPr>
+          <w:lang w:val="it-IT"/>
+        </w:rPr>
+      </w:r>
+      <w:r>
+        <w:rPr>
+          <w:lang w:val="it-IT"/>
+        </w:rPr>
+      </w:r>
+      <w:r>
+        <w:rPr>
+          <w:lang w:val="it-IT"/>
+        </w:rPr>
+      </w:r>
+    </w:p>
+    <w:p>
+      <w:pPr>
+        <w:pBdr/>
+        <w:spacing/>
+        <w:ind/>
+        <w:rPr>
+          <w:highlight w:val="none"/>
+          <w:lang w:val="it-IT" w:bidi="it-IT"/>
+        </w:rPr>
+      </w:pPr>
+      <w:r>
+        <w:rPr>
+          <w:highlight w:val="none"/>
+          <w:lang w:val="it-IT" w:bidi="it-IT"/>
+        </w:rPr>
+      </w:r>
+      <w:r>
+        <mc:AlternateContent>
+          <mc:Choice Requires="wpg">
+            <w:drawing>
+              <wp:inline xmlns:wp="http://schemas.openxmlformats.org/drawingml/2006/wordprocessingDrawing" distT="0" distB="0" distL="0" distR="0">
+                <wp:extent cx="6120130" cy="2360622"/>
+                <wp:effectExtent l="0" t="0" r="0" b="0"/>
+                <wp:docPr id="2" name=""/>
+                <wp:cNvGraphicFramePr>
+                  <a:graphicFrameLocks xmlns:a="http://schemas.openxmlformats.org/drawingml/2006/main" noChangeAspect="1"/>
+                </wp:cNvGraphicFramePr>
+                <a:graphic xmlns:a="http://schemas.openxmlformats.org/drawingml/2006/main">
+                  <a:graphicData uri="http://schemas.openxmlformats.org/drawingml/2006/picture">
+                    <pic:pic xmlns:pic="http://schemas.openxmlformats.org/drawingml/2006/picture">
+                      <pic:nvPicPr>
+                        <pic:cNvPr id="1472413981" name=""/>
+                        <pic:cNvPicPr>
+                          <a:picLocks noChangeAspect="1"/>
+                        </pic:cNvPicPr>
+                        <pic:nvPr/>
+                      </pic:nvPicPr>
+                      <pic:blipFill rotWithShape="1">
+                        <a:blip r:embed="rId9"/>
+                        <a:stretch/>
+                      </pic:blipFill>
+                      <pic:spPr bwMode="auto">
+                        <a:xfrm>
+                          <a:off x="0" y="0"/>
+                          <a:ext cx="6120129" cy="2360621"/>
+                        </a:xfrm>
+                        <a:prstGeom prst="rect">
+                          <a:avLst/>
+                        </a:prstGeom>
+                      </pic:spPr>
+                    </pic:pic>
+                  </a:graphicData>
+                </a:graphic>
+              </wp:inline>
+            </w:drawing>
+          </mc:Choice>
+          <mc:Fallback>
+            <w:pict>
+              <v:shapetype id="_x0000_t75" coordsize="21600,21600" o:spt="75" o:preferrelative="t" path="m@4@5l@4@11@9@11@9@5xe" filled="f" stroked="f">
+                <v:stroke joinstyle="miter"/>
+                <v:formulas>
+                  <v:f eqn="if lineDrawn pixelLineWidth 0"/>
+                  <v:f eqn="sum @0 1 0"/>
+                  <v:f eqn="sum 0 0 @1"/>
+                  <v:f eqn="prod @2 1 2"/>
+                  <v:f eqn="prod @3 21600 pixelWidth"/>
+                  <v:f eqn="prod @3 21600 pixelHeight"/>
+                  <v:f eqn="sum @0 0 1"/>
+                  <v:f eqn="prod @6 1 2"/>
+                  <v:f eqn="prod @7 21600 pixelWidth"/>
+                  <v:f eqn="sum @8 21600 0"/>
+                  <v:f eqn="prod @7 21600 pixelHeight"/>
+                  <v:f eqn="sum @10 21600 0"/>
+                </v:formulas>
+                <v:path o:extrusionok="f" gradientshapeok="t" o:connecttype="rect"/>
+                <o:lock v:ext="edit" aspectratio="t"/>
+              </v:shapetype>
+              <v:shape id="_x0000_i1" o:spid="_x0000_s1" type="#_x0000_t75" style="width:481.90pt;height:185.88pt;mso-wrap-distance-left:0.00pt;mso-wrap-distance-top:0.00pt;mso-wrap-distance-right:0.00pt;mso-wrap-distance-bottom:0.00pt;z-index:1;" stroked="false">
+                <v:imagedata r:id="rId9" o:title=""/>
+                <o:lock v:ext="edit" rotation="t"/>
+              </v:shape>
+            </w:pict>
+          </mc:Fallback>
+        </mc:AlternateContent>
+      </w:r>
+      <w:r>
+        <w:rPr>
+          <w:highlight w:val="none"/>
           <w:lang w:val="it-IT" w:bidi="it-IT"/>
         </w:rPr>
       </w:r>
       <w:r>
         <w:rPr>
           <w:highlight w:val="none"/>
+          <w:lang w:val="it-IT" w:bidi="it-IT"/>
+        </w:rPr>
+      </w:r>
+      <w:r>
+        <w:rPr>
           <w:lang w:val="it-IT"/>
+        </w:rPr>
+      </w:r>
+    </w:p>
+    <w:p>
+      <w:pPr>
+        <w:pBdr/>
+        <w:spacing/>
+        <w:ind/>
+        <w:rPr>
+          <w:lang w:val="it-IT"/>
+        </w:rPr>
+      </w:pPr>
+      <w:r>
+        <w:rPr>
+          <w:highlight w:val="none"/>
+          <w:lang w:val="it-IT" w:bidi="it-IT"/>
+        </w:rPr>
+      </w:r>
+      <w:r>
+        <w:rPr>
+          <w:highlight w:val="none"/>
+          <w:lang w:val="it-IT" w:bidi="it-IT"/>
+        </w:rPr>
+      </w:r>
+      <w:r>
+        <w:rPr>
+          <w:highlight w:val="none"/>
+          <w:lang w:val="it-IT" w:bidi="it-IT"/>
         </w:rPr>
       </w:r>
     </w:p>
@@ -215,7 +424,6 @@
         <w:ind/>
         <w:rPr/>
       </w:pPr>
-      <w:r/>
       <w:r>
         <w:separator/>
       </w:r>
@@ -230,7 +438,6 @@
         <w:ind/>
         <w:rPr/>
       </w:pPr>
-      <w:r/>
       <w:r>
         <w:continuationSeparator/>
       </w:r>
@@ -250,7 +457,6 @@
         <w:ind/>
         <w:rPr/>
       </w:pPr>
-      <w:r/>
       <w:r>
         <w:separator/>
       </w:r>
@@ -265,7 +471,6 @@
         <w:ind/>
         <w:rPr/>
       </w:pPr>
-      <w:r/>
       <w:r>
         <w:continuationSeparator/>
       </w:r>
@@ -433,9 +638,9 @@
     <w:lsdException w:name="Bibliography" w:uiPriority="37"/>
     <w:lsdException w:name="TOC Heading" w:uiPriority="39" w:qFormat="1"/>
   </w:latentStyles>
-  <w:style w:type="table" w:styleId="12">
+  <w:style w:type="table" w:styleId="701">
     <w:name w:val="Table Grid"/>
-    <w:basedOn w:val="666"/>
+    <w:basedOn w:val="889"/>
     <w:uiPriority w:val="59"/>
     <w:pPr>
       <w:pBdr/>
@@ -632,9 +837,9 @@
       </w:tcPr>
     </w:tblStylePr>
   </w:style>
-  <w:style w:type="table" w:styleId="13">
+  <w:style w:type="table" w:styleId="702">
     <w:name w:val="Table Grid Light"/>
-    <w:basedOn w:val="666"/>
+    <w:basedOn w:val="889"/>
     <w:uiPriority w:val="59"/>
     <w:pPr>
       <w:pBdr/>
@@ -831,9 +1036,9 @@
       </w:tcPr>
     </w:tblStylePr>
   </w:style>
-  <w:style w:type="table" w:styleId="14">
+  <w:style w:type="table" w:styleId="703">
     <w:name w:val="Plain Table 1"/>
-    <w:basedOn w:val="666"/>
+    <w:basedOn w:val="889"/>
     <w:uiPriority w:val="59"/>
     <w:pPr>
       <w:pBdr/>
@@ -1056,9 +1261,9 @@
       </w:tcPr>
     </w:tblStylePr>
   </w:style>
-  <w:style w:type="table" w:styleId="15">
+  <w:style w:type="table" w:styleId="704">
     <w:name w:val="Plain Table 2"/>
-    <w:basedOn w:val="666"/>
+    <w:basedOn w:val="889"/>
     <w:uiPriority w:val="59"/>
     <w:pPr>
       <w:pBdr/>
@@ -1289,9 +1494,9 @@
       </w:tcPr>
     </w:tblStylePr>
   </w:style>
-  <w:style w:type="table" w:styleId="16">
+  <w:style w:type="table" w:styleId="705">
     <w:name w:val="Plain Table 3"/>
-    <w:basedOn w:val="666"/>
+    <w:basedOn w:val="889"/>
     <w:uiPriority w:val="99"/>
     <w:pPr>
       <w:pBdr/>
@@ -1519,9 +1724,9 @@
       </w:tcPr>
     </w:tblStylePr>
   </w:style>
-  <w:style w:type="table" w:styleId="17">
+  <w:style w:type="table" w:styleId="706">
     <w:name w:val="Plain Table 4"/>
-    <w:basedOn w:val="666"/>
+    <w:basedOn w:val="889"/>
     <w:uiPriority w:val="99"/>
     <w:pPr>
       <w:pBdr/>
@@ -1735,9 +1940,9 @@
       </w:tcPr>
     </w:tblStylePr>
   </w:style>
-  <w:style w:type="table" w:styleId="18">
+  <w:style w:type="table" w:styleId="707">
     <w:name w:val="Plain Table 5"/>
-    <w:basedOn w:val="666"/>
+    <w:basedOn w:val="889"/>
     <w:uiPriority w:val="99"/>
     <w:pPr>
       <w:pBdr/>
@@ -1968,9 +2173,9 @@
       </w:tcPr>
     </w:tblStylePr>
   </w:style>
-  <w:style w:type="table" w:styleId="19">
+  <w:style w:type="table" w:styleId="708">
     <w:name w:val="Grid Table 1 Light"/>
-    <w:basedOn w:val="666"/>
+    <w:basedOn w:val="889"/>
     <w:uiPriority w:val="99"/>
     <w:pPr>
       <w:pBdr/>
@@ -2191,9 +2396,9 @@
       </w:tcPr>
     </w:tblStylePr>
   </w:style>
-  <w:style w:type="table" w:styleId="20">
+  <w:style w:type="table" w:styleId="709">
     <w:name w:val="Grid Table 1 Light - Accent 1"/>
-    <w:basedOn w:val="666"/>
+    <w:basedOn w:val="889"/>
     <w:uiPriority w:val="99"/>
     <w:pPr>
       <w:pBdr/>
@@ -2414,9 +2619,9 @@
       </w:tcPr>
     </w:tblStylePr>
   </w:style>
-  <w:style w:type="table" w:styleId="21">
+  <w:style w:type="table" w:styleId="710">
     <w:name w:val="Grid Table 1 Light - Accent 2"/>
-    <w:basedOn w:val="666"/>
+    <w:basedOn w:val="889"/>
     <w:uiPriority w:val="99"/>
     <w:pPr>
       <w:pBdr/>
@@ -2637,9 +2842,9 @@
       </w:tcPr>
     </w:tblStylePr>
   </w:style>
-  <w:style w:type="table" w:styleId="22">
+  <w:style w:type="table" w:styleId="711">
     <w:name w:val="Grid Table 1 Light - Accent 3"/>
-    <w:basedOn w:val="666"/>
+    <w:basedOn w:val="889"/>
     <w:uiPriority w:val="99"/>
     <w:pPr>
       <w:pBdr/>
@@ -2860,9 +3065,9 @@
       </w:tcPr>
     </w:tblStylePr>
   </w:style>
-  <w:style w:type="table" w:styleId="23">
+  <w:style w:type="table" w:styleId="712">
     <w:name w:val="Grid Table 1 Light - Accent 4"/>
-    <w:basedOn w:val="666"/>
+    <w:basedOn w:val="889"/>
     <w:uiPriority w:val="99"/>
     <w:pPr>
       <w:pBdr/>
@@ -3083,9 +3288,9 @@
       </w:tcPr>
     </w:tblStylePr>
   </w:style>
-  <w:style w:type="table" w:styleId="24">
+  <w:style w:type="table" w:styleId="713">
     <w:name w:val="Grid Table 1 Light - Accent 5"/>
-    <w:basedOn w:val="666"/>
+    <w:basedOn w:val="889"/>
     <w:uiPriority w:val="99"/>
     <w:pPr>
       <w:pBdr/>
@@ -3306,9 +3511,9 @@
       </w:tcPr>
     </w:tblStylePr>
   </w:style>
-  <w:style w:type="table" w:styleId="25">
+  <w:style w:type="table" w:styleId="714">
     <w:name w:val="Grid Table 1 Light - Accent 6"/>
-    <w:basedOn w:val="666"/>
+    <w:basedOn w:val="889"/>
     <w:uiPriority w:val="99"/>
     <w:pPr>
       <w:pBdr/>
@@ -3529,9 +3734,9 @@
       </w:tcPr>
     </w:tblStylePr>
   </w:style>
-  <w:style w:type="table" w:styleId="26">
+  <w:style w:type="table" w:styleId="715">
     <w:name w:val="Grid Table 2"/>
-    <w:basedOn w:val="666"/>
+    <w:basedOn w:val="889"/>
     <w:uiPriority w:val="99"/>
     <w:pPr>
       <w:pBdr/>
@@ -3761,9 +3966,9 @@
       </w:tcPr>
     </w:tblStylePr>
   </w:style>
-  <w:style w:type="table" w:styleId="27">
+  <w:style w:type="table" w:styleId="716">
     <w:name w:val="Grid Table 2 - Accent 1"/>
-    <w:basedOn w:val="666"/>
+    <w:basedOn w:val="889"/>
     <w:uiPriority w:val="99"/>
     <w:pPr>
       <w:pBdr/>
@@ -3993,9 +4198,9 @@
       </w:tcPr>
     </w:tblStylePr>
   </w:style>
-  <w:style w:type="table" w:styleId="28">
+  <w:style w:type="table" w:styleId="717">
     <w:name w:val="Grid Table 2 - Accent 2"/>
-    <w:basedOn w:val="666"/>
+    <w:basedOn w:val="889"/>
     <w:uiPriority w:val="99"/>
     <w:pPr>
       <w:pBdr/>
@@ -4225,9 +4430,9 @@
       </w:tcPr>
     </w:tblStylePr>
   </w:style>
-  <w:style w:type="table" w:styleId="29">
+  <w:style w:type="table" w:styleId="718">
     <w:name w:val="Grid Table 2 - Accent 3"/>
-    <w:basedOn w:val="666"/>
+    <w:basedOn w:val="889"/>
     <w:uiPriority w:val="99"/>
     <w:pPr>
       <w:pBdr/>
@@ -4457,9 +4662,9 @@
       </w:tcPr>
     </w:tblStylePr>
   </w:style>
-  <w:style w:type="table" w:styleId="30">
+  <w:style w:type="table" w:styleId="719">
     <w:name w:val="Grid Table 2 - Accent 4"/>
-    <w:basedOn w:val="666"/>
+    <w:basedOn w:val="889"/>
     <w:uiPriority w:val="99"/>
     <w:pPr>
       <w:pBdr/>
@@ -4689,9 +4894,9 @@
       </w:tcPr>
     </w:tblStylePr>
   </w:style>
-  <w:style w:type="table" w:styleId="31">
+  <w:style w:type="table" w:styleId="720">
     <w:name w:val="Grid Table 2 - Accent 5"/>
-    <w:basedOn w:val="666"/>
+    <w:basedOn w:val="889"/>
     <w:uiPriority w:val="99"/>
     <w:pPr>
       <w:pBdr/>
@@ -4921,9 +5126,9 @@
       </w:tcPr>
     </w:tblStylePr>
   </w:style>
-  <w:style w:type="table" w:styleId="32">
+  <w:style w:type="table" w:styleId="721">
     <w:name w:val="Grid Table 2 - Accent 6"/>
-    <w:basedOn w:val="666"/>
+    <w:basedOn w:val="889"/>
     <w:uiPriority w:val="99"/>
     <w:pPr>
       <w:pBdr/>
@@ -5153,9 +5358,9 @@
       </w:tcPr>
     </w:tblStylePr>
   </w:style>
-  <w:style w:type="table" w:styleId="33">
+  <w:style w:type="table" w:styleId="722">
     <w:name w:val="Grid Table 3"/>
-    <w:basedOn w:val="666"/>
+    <w:basedOn w:val="889"/>
     <w:uiPriority w:val="99"/>
     <w:pPr>
       <w:pBdr/>
@@ -5254,29 +5459,6 @@
         <w:tblBorders/>
       </w:tblPr>
       <w:tcPr>
-        <w:shd w:color="ffffff"/>
-        <w:tcBorders>
-          <w:top w:val="none" w:color="000000" w:sz="4" w:space="0"/>
-          <w:left w:val="none" w:color="000000" w:sz="4" w:space="0"/>
-          <w:bottom w:val="none" w:color="000000" w:sz="4" w:space="0"/>
-          <w:right w:val="none" w:color="000000" w:sz="4" w:space="0"/>
-        </w:tcBorders>
-      </w:tcPr>
-    </w:tblStylePr>
-    <w:tblStylePr w:type="firstRow">
-      <w:rPr>
-        <w:b/>
-        <w:color w:val="404040"/>
-      </w:rPr>
-      <w:pPr>
-        <w:pBdr/>
-        <w:spacing/>
-        <w:ind/>
-      </w:pPr>
-      <w:tblPr>
-        <w:tblBorders/>
-      </w:tblPr>
-      <w:tcPr>
         <w:shd w:val="clear" w:color="ffffff"/>
         <w:tcBorders>
           <w:top w:val="none" w:color="000000" w:sz="4" w:space="0"/>
@@ -5286,30 +5468,7 @@
         </w:tcBorders>
       </w:tcPr>
     </w:tblStylePr>
-    <w:tblStylePr w:type="lastCol">
-      <w:rPr>
-        <w:i/>
-        <w:color w:val="404040"/>
-      </w:rPr>
-      <w:pPr>
-        <w:pBdr/>
-        <w:spacing/>
-        <w:ind/>
-      </w:pPr>
-      <w:tblPr>
-        <w:tblBorders/>
-      </w:tblPr>
-      <w:tcPr>
-        <w:shd w:color="ffffff"/>
-        <w:tcBorders>
-          <w:top w:val="none" w:color="000000" w:sz="4" w:space="0"/>
-          <w:left w:val="none" w:color="000000" w:sz="4" w:space="0"/>
-          <w:bottom w:val="none" w:color="000000" w:sz="4" w:space="0"/>
-          <w:right w:val="none" w:color="000000" w:sz="4" w:space="0"/>
-        </w:tcBorders>
-      </w:tcPr>
-    </w:tblStylePr>
-    <w:tblStylePr w:type="lastRow">
+    <w:tblStylePr w:type="firstRow">
       <w:rPr>
         <w:b/>
         <w:color w:val="404040"/>
@@ -5332,6 +5491,52 @@
         </w:tcBorders>
       </w:tcPr>
     </w:tblStylePr>
+    <w:tblStylePr w:type="lastCol">
+      <w:rPr>
+        <w:i/>
+        <w:color w:val="404040"/>
+      </w:rPr>
+      <w:pPr>
+        <w:pBdr/>
+        <w:spacing/>
+        <w:ind/>
+      </w:pPr>
+      <w:tblPr>
+        <w:tblBorders/>
+      </w:tblPr>
+      <w:tcPr>
+        <w:shd w:val="clear" w:color="ffffff"/>
+        <w:tcBorders>
+          <w:top w:val="none" w:color="000000" w:sz="4" w:space="0"/>
+          <w:left w:val="none" w:color="000000" w:sz="4" w:space="0"/>
+          <w:bottom w:val="none" w:color="000000" w:sz="4" w:space="0"/>
+          <w:right w:val="none" w:color="000000" w:sz="4" w:space="0"/>
+        </w:tcBorders>
+      </w:tcPr>
+    </w:tblStylePr>
+    <w:tblStylePr w:type="lastRow">
+      <w:rPr>
+        <w:b/>
+        <w:color w:val="404040"/>
+      </w:rPr>
+      <w:pPr>
+        <w:pBdr/>
+        <w:spacing/>
+        <w:ind/>
+      </w:pPr>
+      <w:tblPr>
+        <w:tblBorders/>
+      </w:tblPr>
+      <w:tcPr>
+        <w:shd w:val="clear" w:color="ffffff"/>
+        <w:tcBorders>
+          <w:top w:val="none" w:color="000000" w:sz="4" w:space="0"/>
+          <w:left w:val="none" w:color="000000" w:sz="4" w:space="0"/>
+          <w:bottom w:val="none" w:color="000000" w:sz="4" w:space="0"/>
+          <w:right w:val="none" w:color="000000" w:sz="4" w:space="0"/>
+        </w:tcBorders>
+      </w:tcPr>
+    </w:tblStylePr>
     <w:tblStylePr w:type="nwCell">
       <w:pPr>
         <w:pBdr/>
@@ -5398,9 +5603,9 @@
       </w:tcPr>
     </w:tblStylePr>
   </w:style>
-  <w:style w:type="table" w:styleId="34">
+  <w:style w:type="table" w:styleId="723">
     <w:name w:val="Grid Table 3 - Accent 1"/>
-    <w:basedOn w:val="666"/>
+    <w:basedOn w:val="889"/>
     <w:uiPriority w:val="99"/>
     <w:pPr>
       <w:pBdr/>
@@ -5499,29 +5704,6 @@
         <w:tblBorders/>
       </w:tblPr>
       <w:tcPr>
-        <w:shd w:color="ffffff"/>
-        <w:tcBorders>
-          <w:top w:val="none" w:color="000000" w:sz="4" w:space="0"/>
-          <w:left w:val="none" w:color="000000" w:sz="4" w:space="0"/>
-          <w:bottom w:val="none" w:color="000000" w:sz="4" w:space="0"/>
-          <w:right w:val="none" w:color="000000" w:sz="4" w:space="0"/>
-        </w:tcBorders>
-      </w:tcPr>
-    </w:tblStylePr>
-    <w:tblStylePr w:type="firstRow">
-      <w:rPr>
-        <w:b/>
-        <w:color w:val="404040"/>
-      </w:rPr>
-      <w:pPr>
-        <w:pBdr/>
-        <w:spacing/>
-        <w:ind/>
-      </w:pPr>
-      <w:tblPr>
-        <w:tblBorders/>
-      </w:tblPr>
-      <w:tcPr>
         <w:shd w:val="clear" w:color="ffffff"/>
         <w:tcBorders>
           <w:top w:val="none" w:color="000000" w:sz="4" w:space="0"/>
@@ -5531,30 +5713,7 @@
         </w:tcBorders>
       </w:tcPr>
     </w:tblStylePr>
-    <w:tblStylePr w:type="lastCol">
-      <w:rPr>
-        <w:i/>
-        <w:color w:val="404040"/>
-      </w:rPr>
-      <w:pPr>
-        <w:pBdr/>
-        <w:spacing/>
-        <w:ind/>
-      </w:pPr>
-      <w:tblPr>
-        <w:tblBorders/>
-      </w:tblPr>
-      <w:tcPr>
-        <w:shd w:color="ffffff"/>
-        <w:tcBorders>
-          <w:top w:val="none" w:color="000000" w:sz="4" w:space="0"/>
-          <w:left w:val="none" w:color="000000" w:sz="4" w:space="0"/>
-          <w:bottom w:val="none" w:color="000000" w:sz="4" w:space="0"/>
-          <w:right w:val="none" w:color="000000" w:sz="4" w:space="0"/>
-        </w:tcBorders>
-      </w:tcPr>
-    </w:tblStylePr>
-    <w:tblStylePr w:type="lastRow">
+    <w:tblStylePr w:type="firstRow">
       <w:rPr>
         <w:b/>
         <w:color w:val="404040"/>
@@ -5577,6 +5736,52 @@
         </w:tcBorders>
       </w:tcPr>
     </w:tblStylePr>
+    <w:tblStylePr w:type="lastCol">
+      <w:rPr>
+        <w:i/>
+        <w:color w:val="404040"/>
+      </w:rPr>
+      <w:pPr>
+        <w:pBdr/>
+        <w:spacing/>
+        <w:ind/>
+      </w:pPr>
+      <w:tblPr>
+        <w:tblBorders/>
+      </w:tblPr>
+      <w:tcPr>
+        <w:shd w:val="clear" w:color="ffffff"/>
+        <w:tcBorders>
+          <w:top w:val="none" w:color="000000" w:sz="4" w:space="0"/>
+          <w:left w:val="none" w:color="000000" w:sz="4" w:space="0"/>
+          <w:bottom w:val="none" w:color="000000" w:sz="4" w:space="0"/>
+          <w:right w:val="none" w:color="000000" w:sz="4" w:space="0"/>
+        </w:tcBorders>
+      </w:tcPr>
+    </w:tblStylePr>
+    <w:tblStylePr w:type="lastRow">
+      <w:rPr>
+        <w:b/>
+        <w:color w:val="404040"/>
+      </w:rPr>
+      <w:pPr>
+        <w:pBdr/>
+        <w:spacing/>
+        <w:ind/>
+      </w:pPr>
+      <w:tblPr>
+        <w:tblBorders/>
+      </w:tblPr>
+      <w:tcPr>
+        <w:shd w:val="clear" w:color="ffffff"/>
+        <w:tcBorders>
+          <w:top w:val="none" w:color="000000" w:sz="4" w:space="0"/>
+          <w:left w:val="none" w:color="000000" w:sz="4" w:space="0"/>
+          <w:bottom w:val="none" w:color="000000" w:sz="4" w:space="0"/>
+          <w:right w:val="none" w:color="000000" w:sz="4" w:space="0"/>
+        </w:tcBorders>
+      </w:tcPr>
+    </w:tblStylePr>
     <w:tblStylePr w:type="nwCell">
       <w:pPr>
         <w:pBdr/>
@@ -5643,9 +5848,9 @@
       </w:tcPr>
     </w:tblStylePr>
   </w:style>
-  <w:style w:type="table" w:styleId="35">
+  <w:style w:type="table" w:styleId="724">
     <w:name w:val="Grid Table 3 - Accent 2"/>
-    <w:basedOn w:val="666"/>
+    <w:basedOn w:val="889"/>
     <w:uiPriority w:val="99"/>
     <w:pPr>
       <w:pBdr/>
@@ -5744,29 +5949,6 @@
         <w:tblBorders/>
       </w:tblPr>
       <w:tcPr>
-        <w:shd w:color="ffffff"/>
-        <w:tcBorders>
-          <w:top w:val="none" w:color="000000" w:sz="4" w:space="0"/>
-          <w:left w:val="none" w:color="000000" w:sz="4" w:space="0"/>
-          <w:bottom w:val="none" w:color="000000" w:sz="4" w:space="0"/>
-          <w:right w:val="none" w:color="000000" w:sz="4" w:space="0"/>
-        </w:tcBorders>
-      </w:tcPr>
-    </w:tblStylePr>
-    <w:tblStylePr w:type="firstRow">
-      <w:rPr>
-        <w:b/>
-        <w:color w:val="404040"/>
-      </w:rPr>
-      <w:pPr>
-        <w:pBdr/>
-        <w:spacing/>
-        <w:ind/>
-      </w:pPr>
-      <w:tblPr>
-        <w:tblBorders/>
-      </w:tblPr>
-      <w:tcPr>
         <w:shd w:val="clear" w:color="ffffff"/>
         <w:tcBorders>
           <w:top w:val="none" w:color="000000" w:sz="4" w:space="0"/>
@@ -5776,30 +5958,7 @@
         </w:tcBorders>
       </w:tcPr>
     </w:tblStylePr>
-    <w:tblStylePr w:type="lastCol">
-      <w:rPr>
-        <w:i/>
-        <w:color w:val="404040"/>
-      </w:rPr>
-      <w:pPr>
-        <w:pBdr/>
-        <w:spacing/>
-        <w:ind/>
-      </w:pPr>
-      <w:tblPr>
-        <w:tblBorders/>
-      </w:tblPr>
-      <w:tcPr>
-        <w:shd w:color="ffffff"/>
-        <w:tcBorders>
-          <w:top w:val="none" w:color="000000" w:sz="4" w:space="0"/>
-          <w:left w:val="none" w:color="000000" w:sz="4" w:space="0"/>
-          <w:bottom w:val="none" w:color="000000" w:sz="4" w:space="0"/>
-          <w:right w:val="none" w:color="000000" w:sz="4" w:space="0"/>
-        </w:tcBorders>
-      </w:tcPr>
-    </w:tblStylePr>
-    <w:tblStylePr w:type="lastRow">
+    <w:tblStylePr w:type="firstRow">
       <w:rPr>
         <w:b/>
         <w:color w:val="404040"/>
@@ -5822,6 +5981,52 @@
         </w:tcBorders>
       </w:tcPr>
     </w:tblStylePr>
+    <w:tblStylePr w:type="lastCol">
+      <w:rPr>
+        <w:i/>
+        <w:color w:val="404040"/>
+      </w:rPr>
+      <w:pPr>
+        <w:pBdr/>
+        <w:spacing/>
+        <w:ind/>
+      </w:pPr>
+      <w:tblPr>
+        <w:tblBorders/>
+      </w:tblPr>
+      <w:tcPr>
+        <w:shd w:val="clear" w:color="ffffff"/>
+        <w:tcBorders>
+          <w:top w:val="none" w:color="000000" w:sz="4" w:space="0"/>
+          <w:left w:val="none" w:color="000000" w:sz="4" w:space="0"/>
+          <w:bottom w:val="none" w:color="000000" w:sz="4" w:space="0"/>
+          <w:right w:val="none" w:color="000000" w:sz="4" w:space="0"/>
+        </w:tcBorders>
+      </w:tcPr>
+    </w:tblStylePr>
+    <w:tblStylePr w:type="lastRow">
+      <w:rPr>
+        <w:b/>
+        <w:color w:val="404040"/>
+      </w:rPr>
+      <w:pPr>
+        <w:pBdr/>
+        <w:spacing/>
+        <w:ind/>
+      </w:pPr>
+      <w:tblPr>
+        <w:tblBorders/>
+      </w:tblPr>
+      <w:tcPr>
+        <w:shd w:val="clear" w:color="ffffff"/>
+        <w:tcBorders>
+          <w:top w:val="none" w:color="000000" w:sz="4" w:space="0"/>
+          <w:left w:val="none" w:color="000000" w:sz="4" w:space="0"/>
+          <w:bottom w:val="none" w:color="000000" w:sz="4" w:space="0"/>
+          <w:right w:val="none" w:color="000000" w:sz="4" w:space="0"/>
+        </w:tcBorders>
+      </w:tcPr>
+    </w:tblStylePr>
     <w:tblStylePr w:type="nwCell">
       <w:pPr>
         <w:pBdr/>
@@ -5888,9 +6093,9 @@
       </w:tcPr>
     </w:tblStylePr>
   </w:style>
-  <w:style w:type="table" w:styleId="36">
+  <w:style w:type="table" w:styleId="725">
     <w:name w:val="Grid Table 3 - Accent 3"/>
-    <w:basedOn w:val="666"/>
+    <w:basedOn w:val="889"/>
     <w:uiPriority w:val="99"/>
     <w:pPr>
       <w:pBdr/>
@@ -5989,29 +6194,6 @@
         <w:tblBorders/>
       </w:tblPr>
       <w:tcPr>
-        <w:shd w:color="ffffff"/>
-        <w:tcBorders>
-          <w:top w:val="none" w:color="000000" w:sz="4" w:space="0"/>
-          <w:left w:val="none" w:color="000000" w:sz="4" w:space="0"/>
-          <w:bottom w:val="none" w:color="000000" w:sz="4" w:space="0"/>
-          <w:right w:val="none" w:color="000000" w:sz="4" w:space="0"/>
-        </w:tcBorders>
-      </w:tcPr>
-    </w:tblStylePr>
-    <w:tblStylePr w:type="firstRow">
-      <w:rPr>
-        <w:b/>
-        <w:color w:val="404040"/>
-      </w:rPr>
-      <w:pPr>
-        <w:pBdr/>
-        <w:spacing/>
-        <w:ind/>
-      </w:pPr>
-      <w:tblPr>
-        <w:tblBorders/>
-      </w:tblPr>
-      <w:tcPr>
         <w:shd w:val="clear" w:color="ffffff"/>
         <w:tcBorders>
           <w:top w:val="none" w:color="000000" w:sz="4" w:space="0"/>
@@ -6021,30 +6203,7 @@
         </w:tcBorders>
       </w:tcPr>
     </w:tblStylePr>
-    <w:tblStylePr w:type="lastCol">
-      <w:rPr>
-        <w:i/>
-        <w:color w:val="404040"/>
-      </w:rPr>
-      <w:pPr>
-        <w:pBdr/>
-        <w:spacing/>
-        <w:ind/>
-      </w:pPr>
-      <w:tblPr>
-        <w:tblBorders/>
-      </w:tblPr>
-      <w:tcPr>
-        <w:shd w:color="ffffff"/>
-        <w:tcBorders>
-          <w:top w:val="none" w:color="000000" w:sz="4" w:space="0"/>
-          <w:left w:val="none" w:color="000000" w:sz="4" w:space="0"/>
-          <w:bottom w:val="none" w:color="000000" w:sz="4" w:space="0"/>
-          <w:right w:val="none" w:color="000000" w:sz="4" w:space="0"/>
-        </w:tcBorders>
-      </w:tcPr>
-    </w:tblStylePr>
-    <w:tblStylePr w:type="lastRow">
+    <w:tblStylePr w:type="firstRow">
       <w:rPr>
         <w:b/>
         <w:color w:val="404040"/>
@@ -6067,6 +6226,52 @@
         </w:tcBorders>
       </w:tcPr>
     </w:tblStylePr>
+    <w:tblStylePr w:type="lastCol">
+      <w:rPr>
+        <w:i/>
+        <w:color w:val="404040"/>
+      </w:rPr>
+      <w:pPr>
+        <w:pBdr/>
+        <w:spacing/>
+        <w:ind/>
+      </w:pPr>
+      <w:tblPr>
+        <w:tblBorders/>
+      </w:tblPr>
+      <w:tcPr>
+        <w:shd w:val="clear" w:color="ffffff"/>
+        <w:tcBorders>
+          <w:top w:val="none" w:color="000000" w:sz="4" w:space="0"/>
+          <w:left w:val="none" w:color="000000" w:sz="4" w:space="0"/>
+          <w:bottom w:val="none" w:color="000000" w:sz="4" w:space="0"/>
+          <w:right w:val="none" w:color="000000" w:sz="4" w:space="0"/>
+        </w:tcBorders>
+      </w:tcPr>
+    </w:tblStylePr>
+    <w:tblStylePr w:type="lastRow">
+      <w:rPr>
+        <w:b/>
+        <w:color w:val="404040"/>
+      </w:rPr>
+      <w:pPr>
+        <w:pBdr/>
+        <w:spacing/>
+        <w:ind/>
+      </w:pPr>
+      <w:tblPr>
+        <w:tblBorders/>
+      </w:tblPr>
+      <w:tcPr>
+        <w:shd w:val="clear" w:color="ffffff"/>
+        <w:tcBorders>
+          <w:top w:val="none" w:color="000000" w:sz="4" w:space="0"/>
+          <w:left w:val="none" w:color="000000" w:sz="4" w:space="0"/>
+          <w:bottom w:val="none" w:color="000000" w:sz="4" w:space="0"/>
+          <w:right w:val="none" w:color="000000" w:sz="4" w:space="0"/>
+        </w:tcBorders>
+      </w:tcPr>
+    </w:tblStylePr>
     <w:tblStylePr w:type="nwCell">
       <w:pPr>
         <w:pBdr/>
@@ -6133,9 +6338,9 @@
       </w:tcPr>
     </w:tblStylePr>
   </w:style>
-  <w:style w:type="table" w:styleId="37">
+  <w:style w:type="table" w:styleId="726">
     <w:name w:val="Grid Table 3 - Accent 4"/>
-    <w:basedOn w:val="666"/>
+    <w:basedOn w:val="889"/>
     <w:uiPriority w:val="99"/>
     <w:pPr>
       <w:pBdr/>
@@ -6234,29 +6439,6 @@
         <w:tblBorders/>
       </w:tblPr>
       <w:tcPr>
-        <w:shd w:color="ffffff"/>
-        <w:tcBorders>
-          <w:top w:val="none" w:color="000000" w:sz="4" w:space="0"/>
-          <w:left w:val="none" w:color="000000" w:sz="4" w:space="0"/>
-          <w:bottom w:val="none" w:color="000000" w:sz="4" w:space="0"/>
-          <w:right w:val="none" w:color="000000" w:sz="4" w:space="0"/>
-        </w:tcBorders>
-      </w:tcPr>
-    </w:tblStylePr>
-    <w:tblStylePr w:type="firstRow">
-      <w:rPr>
-        <w:b/>
-        <w:color w:val="404040"/>
-      </w:rPr>
-      <w:pPr>
-        <w:pBdr/>
-        <w:spacing/>
-        <w:ind/>
-      </w:pPr>
-      <w:tblPr>
-        <w:tblBorders/>
-      </w:tblPr>
-      <w:tcPr>
         <w:shd w:val="clear" w:color="ffffff"/>
         <w:tcBorders>
           <w:top w:val="none" w:color="000000" w:sz="4" w:space="0"/>
@@ -6266,30 +6448,7 @@
         </w:tcBorders>
       </w:tcPr>
     </w:tblStylePr>
-    <w:tblStylePr w:type="lastCol">
-      <w:rPr>
-        <w:i/>
-        <w:color w:val="404040"/>
-      </w:rPr>
-      <w:pPr>
-        <w:pBdr/>
-        <w:spacing/>
-        <w:ind/>
-      </w:pPr>
-      <w:tblPr>
-        <w:tblBorders/>
-      </w:tblPr>
-      <w:tcPr>
-        <w:shd w:color="ffffff"/>
-        <w:tcBorders>
-          <w:top w:val="none" w:color="000000" w:sz="4" w:space="0"/>
-          <w:left w:val="none" w:color="000000" w:sz="4" w:space="0"/>
-          <w:bottom w:val="none" w:color="000000" w:sz="4" w:space="0"/>
-          <w:right w:val="none" w:color="000000" w:sz="4" w:space="0"/>
-        </w:tcBorders>
-      </w:tcPr>
-    </w:tblStylePr>
-    <w:tblStylePr w:type="lastRow">
+    <w:tblStylePr w:type="firstRow">
       <w:rPr>
         <w:b/>
         <w:color w:val="404040"/>
@@ -6312,6 +6471,52 @@
         </w:tcBorders>
       </w:tcPr>
     </w:tblStylePr>
+    <w:tblStylePr w:type="lastCol">
+      <w:rPr>
+        <w:i/>
+        <w:color w:val="404040"/>
+      </w:rPr>
+      <w:pPr>
+        <w:pBdr/>
+        <w:spacing/>
+        <w:ind/>
+      </w:pPr>
+      <w:tblPr>
+        <w:tblBorders/>
+      </w:tblPr>
+      <w:tcPr>
+        <w:shd w:val="clear" w:color="ffffff"/>
+        <w:tcBorders>
+          <w:top w:val="none" w:color="000000" w:sz="4" w:space="0"/>
+          <w:left w:val="none" w:color="000000" w:sz="4" w:space="0"/>
+          <w:bottom w:val="none" w:color="000000" w:sz="4" w:space="0"/>
+          <w:right w:val="none" w:color="000000" w:sz="4" w:space="0"/>
+        </w:tcBorders>
+      </w:tcPr>
+    </w:tblStylePr>
+    <w:tblStylePr w:type="lastRow">
+      <w:rPr>
+        <w:b/>
+        <w:color w:val="404040"/>
+      </w:rPr>
+      <w:pPr>
+        <w:pBdr/>
+        <w:spacing/>
+        <w:ind/>
+      </w:pPr>
+      <w:tblPr>
+        <w:tblBorders/>
+      </w:tblPr>
+      <w:tcPr>
+        <w:shd w:val="clear" w:color="ffffff"/>
+        <w:tcBorders>
+          <w:top w:val="none" w:color="000000" w:sz="4" w:space="0"/>
+          <w:left w:val="none" w:color="000000" w:sz="4" w:space="0"/>
+          <w:bottom w:val="none" w:color="000000" w:sz="4" w:space="0"/>
+          <w:right w:val="none" w:color="000000" w:sz="4" w:space="0"/>
+        </w:tcBorders>
+      </w:tcPr>
+    </w:tblStylePr>
     <w:tblStylePr w:type="nwCell">
       <w:pPr>
         <w:pBdr/>
@@ -6378,9 +6583,9 @@
       </w:tcPr>
     </w:tblStylePr>
   </w:style>
-  <w:style w:type="table" w:styleId="38">
+  <w:style w:type="table" w:styleId="727">
     <w:name w:val="Grid Table 3 - Accent 5"/>
-    <w:basedOn w:val="666"/>
+    <w:basedOn w:val="889"/>
     <w:uiPriority w:val="99"/>
     <w:pPr>
       <w:pBdr/>
@@ -6479,29 +6684,6 @@
         <w:tblBorders/>
       </w:tblPr>
       <w:tcPr>
-        <w:shd w:color="ffffff"/>
-        <w:tcBorders>
-          <w:top w:val="none" w:color="000000" w:sz="4" w:space="0"/>
-          <w:left w:val="none" w:color="000000" w:sz="4" w:space="0"/>
-          <w:bottom w:val="none" w:color="000000" w:sz="4" w:space="0"/>
-          <w:right w:val="none" w:color="000000" w:sz="4" w:space="0"/>
-        </w:tcBorders>
-      </w:tcPr>
-    </w:tblStylePr>
-    <w:tblStylePr w:type="firstRow">
-      <w:rPr>
-        <w:b/>
-        <w:color w:val="404040"/>
-      </w:rPr>
-      <w:pPr>
-        <w:pBdr/>
-        <w:spacing/>
-        <w:ind/>
-      </w:pPr>
-      <w:tblPr>
-        <w:tblBorders/>
-      </w:tblPr>
-      <w:tcPr>
         <w:shd w:val="clear" w:color="ffffff"/>
         <w:tcBorders>
           <w:top w:val="none" w:color="000000" w:sz="4" w:space="0"/>
@@ -6511,30 +6693,7 @@
         </w:tcBorders>
       </w:tcPr>
     </w:tblStylePr>
-    <w:tblStylePr w:type="lastCol">
-      <w:rPr>
-        <w:i/>
-        <w:color w:val="404040"/>
-      </w:rPr>
-      <w:pPr>
-        <w:pBdr/>
-        <w:spacing/>
-        <w:ind/>
-      </w:pPr>
-      <w:tblPr>
-        <w:tblBorders/>
-      </w:tblPr>
-      <w:tcPr>
-        <w:shd w:color="ffffff"/>
-        <w:tcBorders>
-          <w:top w:val="none" w:color="000000" w:sz="4" w:space="0"/>
-          <w:left w:val="none" w:color="000000" w:sz="4" w:space="0"/>
-          <w:bottom w:val="none" w:color="000000" w:sz="4" w:space="0"/>
-          <w:right w:val="none" w:color="000000" w:sz="4" w:space="0"/>
-        </w:tcBorders>
-      </w:tcPr>
-    </w:tblStylePr>
-    <w:tblStylePr w:type="lastRow">
+    <w:tblStylePr w:type="firstRow">
       <w:rPr>
         <w:b/>
         <w:color w:val="404040"/>
@@ -6557,6 +6716,52 @@
         </w:tcBorders>
       </w:tcPr>
     </w:tblStylePr>
+    <w:tblStylePr w:type="lastCol">
+      <w:rPr>
+        <w:i/>
+        <w:color w:val="404040"/>
+      </w:rPr>
+      <w:pPr>
+        <w:pBdr/>
+        <w:spacing/>
+        <w:ind/>
+      </w:pPr>
+      <w:tblPr>
+        <w:tblBorders/>
+      </w:tblPr>
+      <w:tcPr>
+        <w:shd w:val="clear" w:color="ffffff"/>
+        <w:tcBorders>
+          <w:top w:val="none" w:color="000000" w:sz="4" w:space="0"/>
+          <w:left w:val="none" w:color="000000" w:sz="4" w:space="0"/>
+          <w:bottom w:val="none" w:color="000000" w:sz="4" w:space="0"/>
+          <w:right w:val="none" w:color="000000" w:sz="4" w:space="0"/>
+        </w:tcBorders>
+      </w:tcPr>
+    </w:tblStylePr>
+    <w:tblStylePr w:type="lastRow">
+      <w:rPr>
+        <w:b/>
+        <w:color w:val="404040"/>
+      </w:rPr>
+      <w:pPr>
+        <w:pBdr/>
+        <w:spacing/>
+        <w:ind/>
+      </w:pPr>
+      <w:tblPr>
+        <w:tblBorders/>
+      </w:tblPr>
+      <w:tcPr>
+        <w:shd w:val="clear" w:color="ffffff"/>
+        <w:tcBorders>
+          <w:top w:val="none" w:color="000000" w:sz="4" w:space="0"/>
+          <w:left w:val="none" w:color="000000" w:sz="4" w:space="0"/>
+          <w:bottom w:val="none" w:color="000000" w:sz="4" w:space="0"/>
+          <w:right w:val="none" w:color="000000" w:sz="4" w:space="0"/>
+        </w:tcBorders>
+      </w:tcPr>
+    </w:tblStylePr>
     <w:tblStylePr w:type="nwCell">
       <w:pPr>
         <w:pBdr/>
@@ -6623,9 +6828,9 @@
       </w:tcPr>
     </w:tblStylePr>
   </w:style>
-  <w:style w:type="table" w:styleId="39">
+  <w:style w:type="table" w:styleId="728">
     <w:name w:val="Grid Table 3 - Accent 6"/>
-    <w:basedOn w:val="666"/>
+    <w:basedOn w:val="889"/>
     <w:uiPriority w:val="99"/>
     <w:pPr>
       <w:pBdr/>
@@ -6724,29 +6929,6 @@
         <w:tblBorders/>
       </w:tblPr>
       <w:tcPr>
-        <w:shd w:color="ffffff"/>
-        <w:tcBorders>
-          <w:top w:val="none" w:color="000000" w:sz="4" w:space="0"/>
-          <w:left w:val="none" w:color="000000" w:sz="4" w:space="0"/>
-          <w:bottom w:val="none" w:color="000000" w:sz="4" w:space="0"/>
-          <w:right w:val="none" w:color="000000" w:sz="4" w:space="0"/>
-        </w:tcBorders>
-      </w:tcPr>
-    </w:tblStylePr>
-    <w:tblStylePr w:type="firstRow">
-      <w:rPr>
-        <w:b/>
-        <w:color w:val="404040"/>
-      </w:rPr>
-      <w:pPr>
-        <w:pBdr/>
-        <w:spacing/>
-        <w:ind/>
-      </w:pPr>
-      <w:tblPr>
-        <w:tblBorders/>
-      </w:tblPr>
-      <w:tcPr>
         <w:shd w:val="clear" w:color="ffffff"/>
         <w:tcBorders>
           <w:top w:val="none" w:color="000000" w:sz="4" w:space="0"/>
@@ -6756,30 +6938,7 @@
         </w:tcBorders>
       </w:tcPr>
     </w:tblStylePr>
-    <w:tblStylePr w:type="lastCol">
-      <w:rPr>
-        <w:i/>
-        <w:color w:val="404040"/>
-      </w:rPr>
-      <w:pPr>
-        <w:pBdr/>
-        <w:spacing/>
-        <w:ind/>
-      </w:pPr>
-      <w:tblPr>
-        <w:tblBorders/>
-      </w:tblPr>
-      <w:tcPr>
-        <w:shd w:color="ffffff"/>
-        <w:tcBorders>
-          <w:top w:val="none" w:color="000000" w:sz="4" w:space="0"/>
-          <w:left w:val="none" w:color="000000" w:sz="4" w:space="0"/>
-          <w:bottom w:val="none" w:color="000000" w:sz="4" w:space="0"/>
-          <w:right w:val="none" w:color="000000" w:sz="4" w:space="0"/>
-        </w:tcBorders>
-      </w:tcPr>
-    </w:tblStylePr>
-    <w:tblStylePr w:type="lastRow">
+    <w:tblStylePr w:type="firstRow">
       <w:rPr>
         <w:b/>
         <w:color w:val="404040"/>
@@ -6802,6 +6961,52 @@
         </w:tcBorders>
       </w:tcPr>
     </w:tblStylePr>
+    <w:tblStylePr w:type="lastCol">
+      <w:rPr>
+        <w:i/>
+        <w:color w:val="404040"/>
+      </w:rPr>
+      <w:pPr>
+        <w:pBdr/>
+        <w:spacing/>
+        <w:ind/>
+      </w:pPr>
+      <w:tblPr>
+        <w:tblBorders/>
+      </w:tblPr>
+      <w:tcPr>
+        <w:shd w:val="clear" w:color="ffffff"/>
+        <w:tcBorders>
+          <w:top w:val="none" w:color="000000" w:sz="4" w:space="0"/>
+          <w:left w:val="none" w:color="000000" w:sz="4" w:space="0"/>
+          <w:bottom w:val="none" w:color="000000" w:sz="4" w:space="0"/>
+          <w:right w:val="none" w:color="000000" w:sz="4" w:space="0"/>
+        </w:tcBorders>
+      </w:tcPr>
+    </w:tblStylePr>
+    <w:tblStylePr w:type="lastRow">
+      <w:rPr>
+        <w:b/>
+        <w:color w:val="404040"/>
+      </w:rPr>
+      <w:pPr>
+        <w:pBdr/>
+        <w:spacing/>
+        <w:ind/>
+      </w:pPr>
+      <w:tblPr>
+        <w:tblBorders/>
+      </w:tblPr>
+      <w:tcPr>
+        <w:shd w:val="clear" w:color="ffffff"/>
+        <w:tcBorders>
+          <w:top w:val="none" w:color="000000" w:sz="4" w:space="0"/>
+          <w:left w:val="none" w:color="000000" w:sz="4" w:space="0"/>
+          <w:bottom w:val="none" w:color="000000" w:sz="4" w:space="0"/>
+          <w:right w:val="none" w:color="000000" w:sz="4" w:space="0"/>
+        </w:tcBorders>
+      </w:tcPr>
+    </w:tblStylePr>
     <w:tblStylePr w:type="nwCell">
       <w:pPr>
         <w:pBdr/>
@@ -6868,9 +7073,9 @@
       </w:tcPr>
     </w:tblStylePr>
   </w:style>
-  <w:style w:type="table" w:styleId="40">
+  <w:style w:type="table" w:styleId="729">
     <w:name w:val="Grid Table 4"/>
-    <w:basedOn w:val="666"/>
+    <w:basedOn w:val="889"/>
     <w:uiPriority w:val="59"/>
     <w:pPr>
       <w:pBdr/>
@@ -7101,9 +7306,9 @@
       </w:tcPr>
     </w:tblStylePr>
   </w:style>
-  <w:style w:type="table" w:styleId="41">
+  <w:style w:type="table" w:styleId="730">
     <w:name w:val="Grid Table 4 - Accent 1"/>
-    <w:basedOn w:val="666"/>
+    <w:basedOn w:val="889"/>
     <w:uiPriority w:val="59"/>
     <w:pPr>
       <w:pBdr/>
@@ -7334,9 +7539,9 @@
       </w:tcPr>
     </w:tblStylePr>
   </w:style>
-  <w:style w:type="table" w:styleId="42">
+  <w:style w:type="table" w:styleId="731">
     <w:name w:val="Grid Table 4 - Accent 2"/>
-    <w:basedOn w:val="666"/>
+    <w:basedOn w:val="889"/>
     <w:uiPriority w:val="59"/>
     <w:pPr>
       <w:pBdr/>
@@ -7567,9 +7772,9 @@
       </w:tcPr>
     </w:tblStylePr>
   </w:style>
-  <w:style w:type="table" w:styleId="43">
+  <w:style w:type="table" w:styleId="732">
     <w:name w:val="Grid Table 4 - Accent 3"/>
-    <w:basedOn w:val="666"/>
+    <w:basedOn w:val="889"/>
     <w:uiPriority w:val="59"/>
     <w:pPr>
       <w:pBdr/>
@@ -7800,9 +8005,9 @@
       </w:tcPr>
     </w:tblStylePr>
   </w:style>
-  <w:style w:type="table" w:styleId="44">
+  <w:style w:type="table" w:styleId="733">
     <w:name w:val="Grid Table 4 - Accent 4"/>
-    <w:basedOn w:val="666"/>
+    <w:basedOn w:val="889"/>
     <w:uiPriority w:val="59"/>
     <w:pPr>
       <w:pBdr/>
@@ -8033,9 +8238,9 @@
       </w:tcPr>
     </w:tblStylePr>
   </w:style>
-  <w:style w:type="table" w:styleId="45">
+  <w:style w:type="table" w:styleId="734">
     <w:name w:val="Grid Table 4 - Accent 5"/>
-    <w:basedOn w:val="666"/>
+    <w:basedOn w:val="889"/>
     <w:uiPriority w:val="59"/>
     <w:pPr>
       <w:pBdr/>
@@ -8266,9 +8471,9 @@
       </w:tcPr>
     </w:tblStylePr>
   </w:style>
-  <w:style w:type="table" w:styleId="46">
+  <w:style w:type="table" w:styleId="735">
     <w:name w:val="Grid Table 4 - Accent 6"/>
-    <w:basedOn w:val="666"/>
+    <w:basedOn w:val="889"/>
     <w:uiPriority w:val="59"/>
     <w:pPr>
       <w:pBdr/>
@@ -8499,9 +8704,9 @@
       </w:tcPr>
     </w:tblStylePr>
   </w:style>
-  <w:style w:type="table" w:styleId="47">
+  <w:style w:type="table" w:styleId="736">
     <w:name w:val="Grid Table 5 Dark"/>
-    <w:basedOn w:val="666"/>
+    <w:basedOn w:val="889"/>
     <w:uiPriority w:val="99"/>
     <w:pPr>
       <w:pBdr/>
@@ -8727,9 +8932,9 @@
       </w:tcPr>
     </w:tblStylePr>
   </w:style>
-  <w:style w:type="table" w:styleId="48">
+  <w:style w:type="table" w:styleId="737">
     <w:name w:val="Grid Table 5 Dark- Accent 1"/>
-    <w:basedOn w:val="666"/>
+    <w:basedOn w:val="889"/>
     <w:uiPriority w:val="99"/>
     <w:pPr>
       <w:pBdr/>
@@ -8955,9 +9160,9 @@
       </w:tcPr>
     </w:tblStylePr>
   </w:style>
-  <w:style w:type="table" w:styleId="49">
+  <w:style w:type="table" w:styleId="738">
     <w:name w:val="Grid Table 5 Dark - Accent 2"/>
-    <w:basedOn w:val="666"/>
+    <w:basedOn w:val="889"/>
     <w:uiPriority w:val="99"/>
     <w:pPr>
       <w:pBdr/>
@@ -9183,9 +9388,9 @@
       </w:tcPr>
     </w:tblStylePr>
   </w:style>
-  <w:style w:type="table" w:styleId="50">
+  <w:style w:type="table" w:styleId="739">
     <w:name w:val="Grid Table 5 Dark - Accent 3"/>
-    <w:basedOn w:val="666"/>
+    <w:basedOn w:val="889"/>
     <w:uiPriority w:val="99"/>
     <w:pPr>
       <w:pBdr/>
@@ -9411,9 +9616,9 @@
       </w:tcPr>
     </w:tblStylePr>
   </w:style>
-  <w:style w:type="table" w:styleId="51">
+  <w:style w:type="table" w:styleId="740">
     <w:name w:val="Grid Table 5 Dark- Accent 4"/>
-    <w:basedOn w:val="666"/>
+    <w:basedOn w:val="889"/>
     <w:uiPriority w:val="99"/>
     <w:pPr>
       <w:pBdr/>
@@ -9639,9 +9844,9 @@
       </w:tcPr>
     </w:tblStylePr>
   </w:style>
-  <w:style w:type="table" w:styleId="52">
+  <w:style w:type="table" w:styleId="741">
     <w:name w:val="Grid Table 5 Dark - Accent 5"/>
-    <w:basedOn w:val="666"/>
+    <w:basedOn w:val="889"/>
     <w:uiPriority w:val="99"/>
     <w:pPr>
       <w:pBdr/>
@@ -9867,9 +10072,9 @@
       </w:tcPr>
     </w:tblStylePr>
   </w:style>
-  <w:style w:type="table" w:styleId="53">
+  <w:style w:type="table" w:styleId="742">
     <w:name w:val="Grid Table 5 Dark - Accent 6"/>
-    <w:basedOn w:val="666"/>
+    <w:basedOn w:val="889"/>
     <w:uiPriority w:val="99"/>
     <w:pPr>
       <w:pBdr/>
@@ -10095,9 +10300,9 @@
       </w:tcPr>
     </w:tblStylePr>
   </w:style>
-  <w:style w:type="table" w:styleId="54">
+  <w:style w:type="table" w:styleId="743">
     <w:name w:val="Grid Table 6 Colorful"/>
-    <w:basedOn w:val="666"/>
+    <w:basedOn w:val="889"/>
     <w:uiPriority w:val="99"/>
     <w:pPr>
       <w:pBdr/>
@@ -10325,9 +10530,9 @@
       </w:tcPr>
     </w:tblStylePr>
   </w:style>
-  <w:style w:type="table" w:styleId="55">
+  <w:style w:type="table" w:styleId="744">
     <w:name w:val="Grid Table 6 Colorful - Accent 1"/>
-    <w:basedOn w:val="666"/>
+    <w:basedOn w:val="889"/>
     <w:uiPriority w:val="99"/>
     <w:pPr>
       <w:pBdr/>
@@ -10555,9 +10760,9 @@
       </w:tcPr>
     </w:tblStylePr>
   </w:style>
-  <w:style w:type="table" w:styleId="56">
+  <w:style w:type="table" w:styleId="745">
     <w:name w:val="Grid Table 6 Colorful - Accent 2"/>
-    <w:basedOn w:val="666"/>
+    <w:basedOn w:val="889"/>
     <w:uiPriority w:val="99"/>
     <w:pPr>
       <w:pBdr/>
@@ -10785,9 +10990,9 @@
       </w:tcPr>
     </w:tblStylePr>
   </w:style>
-  <w:style w:type="table" w:styleId="57">
+  <w:style w:type="table" w:styleId="746">
     <w:name w:val="Grid Table 6 Colorful - Accent 3"/>
-    <w:basedOn w:val="666"/>
+    <w:basedOn w:val="889"/>
     <w:uiPriority w:val="99"/>
     <w:pPr>
       <w:pBdr/>
@@ -11015,9 +11220,9 @@
       </w:tcPr>
     </w:tblStylePr>
   </w:style>
-  <w:style w:type="table" w:styleId="58">
+  <w:style w:type="table" w:styleId="747">
     <w:name w:val="Grid Table 6 Colorful - Accent 4"/>
-    <w:basedOn w:val="666"/>
+    <w:basedOn w:val="889"/>
     <w:uiPriority w:val="99"/>
     <w:pPr>
       <w:pBdr/>
@@ -11245,9 +11450,9 @@
       </w:tcPr>
     </w:tblStylePr>
   </w:style>
-  <w:style w:type="table" w:styleId="59">
+  <w:style w:type="table" w:styleId="748">
     <w:name w:val="Grid Table 6 Colorful - Accent 5"/>
-    <w:basedOn w:val="666"/>
+    <w:basedOn w:val="889"/>
     <w:uiPriority w:val="99"/>
     <w:pPr>
       <w:pBdr/>
@@ -11475,9 +11680,9 @@
       </w:tcPr>
     </w:tblStylePr>
   </w:style>
-  <w:style w:type="table" w:styleId="60">
+  <w:style w:type="table" w:styleId="749">
     <w:name w:val="Grid Table 6 Colorful - Accent 6"/>
-    <w:basedOn w:val="666"/>
+    <w:basedOn w:val="889"/>
     <w:uiPriority w:val="99"/>
     <w:pPr>
       <w:pBdr/>
@@ -11705,9 +11910,9 @@
       </w:tcPr>
     </w:tblStylePr>
   </w:style>
-  <w:style w:type="table" w:styleId="61">
+  <w:style w:type="table" w:styleId="750">
     <w:name w:val="Grid Table 7 Colorful"/>
-    <w:basedOn w:val="666"/>
+    <w:basedOn w:val="889"/>
     <w:uiPriority w:val="99"/>
     <w:pPr>
       <w:pBdr/>
@@ -11809,11 +12014,11 @@
         <w:tblBorders/>
       </w:tblPr>
       <w:tcPr>
-        <w:shd w:color="ffffff"/>
+        <w:shd w:val="clear" w:color="ffffff"/>
         <w:tcBorders>
-          <w:top w:val="none"/>
-          <w:left w:val="none"/>
-          <w:bottom w:val="none"/>
+          <w:top w:val="none" w:color="000000" w:sz="4" w:space="0"/>
+          <w:left w:val="none" w:color="000000" w:sz="4" w:space="0"/>
+          <w:bottom w:val="none" w:color="000000" w:sz="4" w:space="0"/>
           <w:right w:val="single" w:color="000000" w:themeColor="text1" w:themeTint="80" w:sz="4" w:space="0"/>
         </w:tcBorders>
       </w:tcPr>
@@ -11836,10 +12041,10 @@
       <w:tcPr>
         <w:shd w:val="clear" w:color="ffffff" w:themeColor="light1" w:fill="ffffff" w:themeFill="light1"/>
         <w:tcBorders>
-          <w:top w:val="none"/>
-          <w:left w:val="none"/>
+          <w:top w:val="none" w:color="000000" w:sz="4" w:space="0"/>
+          <w:left w:val="none" w:color="000000" w:sz="4" w:space="0"/>
           <w:bottom w:val="single" w:color="000000" w:themeColor="text1" w:themeTint="80" w:sz="4" w:space="0"/>
-          <w:right w:val="none"/>
+          <w:right w:val="none" w:color="000000" w:sz="4" w:space="0"/>
         </w:tcBorders>
       </w:tcPr>
     </w:tblStylePr>
@@ -11859,12 +12064,12 @@
         <w:tblBorders/>
       </w:tblPr>
       <w:tcPr>
-        <w:shd w:color="ffffff"/>
+        <w:shd w:val="clear" w:color="ffffff"/>
         <w:tcBorders>
-          <w:top w:val="none"/>
+          <w:top w:val="none" w:color="000000" w:sz="4" w:space="0"/>
           <w:left w:val="single" w:color="000000" w:themeColor="text1" w:themeTint="80" w:sz="4" w:space="0"/>
-          <w:bottom w:val="none"/>
-          <w:right w:val="none"/>
+          <w:bottom w:val="none" w:color="000000" w:sz="4" w:space="0"/>
+          <w:right w:val="none" w:color="000000" w:sz="4" w:space="0"/>
         </w:tcBorders>
       </w:tcPr>
     </w:tblStylePr>
@@ -11887,9 +12092,9 @@
         <w:shd w:val="clear" w:color="ffffff" w:themeColor="light1" w:fill="ffffff" w:themeFill="light1"/>
         <w:tcBorders>
           <w:top w:val="single" w:color="000000" w:themeColor="text1" w:themeTint="80" w:sz="4" w:space="0"/>
-          <w:left w:val="none"/>
-          <w:bottom w:val="none"/>
-          <w:right w:val="none"/>
+          <w:left w:val="none" w:color="000000" w:sz="4" w:space="0"/>
+          <w:bottom w:val="none" w:color="000000" w:sz="4" w:space="0"/>
+          <w:right w:val="none" w:color="000000" w:sz="4" w:space="0"/>
         </w:tcBorders>
       </w:tcPr>
     </w:tblStylePr>
@@ -11959,9 +12164,9 @@
       </w:tcPr>
     </w:tblStylePr>
   </w:style>
-  <w:style w:type="table" w:styleId="62">
+  <w:style w:type="table" w:styleId="751">
     <w:name w:val="Grid Table 7 Colorful - Accent 1"/>
-    <w:basedOn w:val="666"/>
+    <w:basedOn w:val="889"/>
     <w:uiPriority w:val="99"/>
     <w:pPr>
       <w:pBdr/>
@@ -12063,11 +12268,11 @@
         <w:tblBorders/>
       </w:tblPr>
       <w:tcPr>
-        <w:shd w:color="ffffff"/>
+        <w:shd w:val="clear" w:color="ffffff"/>
         <w:tcBorders>
-          <w:top w:val="none"/>
-          <w:left w:val="none"/>
-          <w:bottom w:val="none"/>
+          <w:top w:val="none" w:color="000000" w:sz="4" w:space="0"/>
+          <w:left w:val="none" w:color="000000" w:sz="4" w:space="0"/>
+          <w:bottom w:val="none" w:color="000000" w:sz="4" w:space="0"/>
           <w:right w:val="single" w:color="000000" w:themeColor="accent1" w:themeTint="80" w:sz="4" w:space="0"/>
         </w:tcBorders>
       </w:tcPr>
@@ -12090,10 +12295,10 @@
       <w:tcPr>
         <w:shd w:val="clear" w:color="ffffff" w:themeColor="light1" w:fill="ffffff" w:themeFill="light1"/>
         <w:tcBorders>
-          <w:top w:val="none"/>
-          <w:left w:val="none"/>
+          <w:top w:val="none" w:color="000000" w:sz="4" w:space="0"/>
+          <w:left w:val="none" w:color="000000" w:sz="4" w:space="0"/>
           <w:bottom w:val="single" w:color="000000" w:themeColor="accent1" w:themeTint="80" w:sz="4" w:space="0"/>
-          <w:right w:val="none"/>
+          <w:right w:val="none" w:color="000000" w:sz="4" w:space="0"/>
         </w:tcBorders>
       </w:tcPr>
     </w:tblStylePr>
@@ -12113,12 +12318,12 @@
         <w:tblBorders/>
       </w:tblPr>
       <w:tcPr>
-        <w:shd w:color="ffffff"/>
+        <w:shd w:val="clear" w:color="ffffff"/>
         <w:tcBorders>
-          <w:top w:val="none"/>
+          <w:top w:val="none" w:color="000000" w:sz="4" w:space="0"/>
           <w:left w:val="single" w:color="000000" w:themeColor="accent1" w:themeTint="80" w:sz="4" w:space="0"/>
-          <w:bottom w:val="none"/>
-          <w:right w:val="none"/>
+          <w:bottom w:val="none" w:color="000000" w:sz="4" w:space="0"/>
+          <w:right w:val="none" w:color="000000" w:sz="4" w:space="0"/>
         </w:tcBorders>
       </w:tcPr>
     </w:tblStylePr>
@@ -12141,9 +12346,9 @@
         <w:shd w:val="clear" w:color="ffffff" w:themeColor="light1" w:fill="ffffff" w:themeFill="light1"/>
         <w:tcBorders>
           <w:top w:val="single" w:color="000000" w:themeColor="accent1" w:themeTint="80" w:sz="4" w:space="0"/>
-          <w:left w:val="none"/>
-          <w:bottom w:val="none"/>
-          <w:right w:val="none"/>
+          <w:left w:val="none" w:color="000000" w:sz="4" w:space="0"/>
+          <w:bottom w:val="none" w:color="000000" w:sz="4" w:space="0"/>
+          <w:right w:val="none" w:color="000000" w:sz="4" w:space="0"/>
         </w:tcBorders>
       </w:tcPr>
     </w:tblStylePr>
@@ -12213,9 +12418,9 @@
       </w:tcPr>
     </w:tblStylePr>
   </w:style>
-  <w:style w:type="table" w:styleId="63">
+  <w:style w:type="table" w:styleId="752">
     <w:name w:val="Grid Table 7 Colorful - Accent 2"/>
-    <w:basedOn w:val="666"/>
+    <w:basedOn w:val="889"/>
     <w:uiPriority w:val="99"/>
     <w:pPr>
       <w:pBdr/>
@@ -12317,11 +12522,11 @@
         <w:tblBorders/>
       </w:tblPr>
       <w:tcPr>
-        <w:shd w:color="ffffff"/>
+        <w:shd w:val="clear" w:color="ffffff"/>
         <w:tcBorders>
-          <w:top w:val="none"/>
-          <w:left w:val="none"/>
-          <w:bottom w:val="none"/>
+          <w:top w:val="none" w:color="000000" w:sz="4" w:space="0"/>
+          <w:left w:val="none" w:color="000000" w:sz="4" w:space="0"/>
+          <w:bottom w:val="none" w:color="000000" w:sz="4" w:space="0"/>
           <w:right w:val="single" w:color="000000" w:themeColor="accent2" w:themeTint="97" w:sz="4" w:space="0"/>
         </w:tcBorders>
       </w:tcPr>
@@ -12344,10 +12549,10 @@
       <w:tcPr>
         <w:shd w:val="clear" w:color="ffffff" w:themeColor="light1" w:fill="ffffff" w:themeFill="light1"/>
         <w:tcBorders>
-          <w:top w:val="none"/>
-          <w:left w:val="none"/>
+          <w:top w:val="none" w:color="000000" w:sz="4" w:space="0"/>
+          <w:left w:val="none" w:color="000000" w:sz="4" w:space="0"/>
           <w:bottom w:val="single" w:color="000000" w:themeColor="accent2" w:themeTint="97" w:sz="4" w:space="0"/>
-          <w:right w:val="none"/>
+          <w:right w:val="none" w:color="000000" w:sz="4" w:space="0"/>
         </w:tcBorders>
       </w:tcPr>
     </w:tblStylePr>
@@ -12367,12 +12572,12 @@
         <w:tblBorders/>
       </w:tblPr>
       <w:tcPr>
-        <w:shd w:color="ffffff"/>
+        <w:shd w:val="clear" w:color="ffffff"/>
         <w:tcBorders>
-          <w:top w:val="none"/>
+          <w:top w:val="none" w:color="000000" w:sz="4" w:space="0"/>
           <w:left w:val="single" w:color="000000" w:themeColor="accent2" w:themeTint="97" w:sz="4" w:space="0"/>
-          <w:bottom w:val="none"/>
-          <w:right w:val="none"/>
+          <w:bottom w:val="none" w:color="000000" w:sz="4" w:space="0"/>
+          <w:right w:val="none" w:color="000000" w:sz="4" w:space="0"/>
         </w:tcBorders>
       </w:tcPr>
     </w:tblStylePr>
@@ -12395,9 +12600,9 @@
         <w:shd w:val="clear" w:color="ffffff" w:themeColor="light1" w:fill="ffffff" w:themeFill="light1"/>
         <w:tcBorders>
           <w:top w:val="single" w:color="000000" w:themeColor="accent2" w:themeTint="97" w:sz="4" w:space="0"/>
-          <w:left w:val="none"/>
-          <w:bottom w:val="none"/>
-          <w:right w:val="none"/>
+          <w:left w:val="none" w:color="000000" w:sz="4" w:space="0"/>
+          <w:bottom w:val="none" w:color="000000" w:sz="4" w:space="0"/>
+          <w:right w:val="none" w:color="000000" w:sz="4" w:space="0"/>
         </w:tcBorders>
       </w:tcPr>
     </w:tblStylePr>
@@ -12467,9 +12672,9 @@
       </w:tcPr>
     </w:tblStylePr>
   </w:style>
-  <w:style w:type="table" w:styleId="64">
+  <w:style w:type="table" w:styleId="753">
     <w:name w:val="Grid Table 7 Colorful - Accent 3"/>
-    <w:basedOn w:val="666"/>
+    <w:basedOn w:val="889"/>
     <w:uiPriority w:val="99"/>
     <w:pPr>
       <w:pBdr/>
@@ -12571,11 +12776,11 @@
         <w:tblBorders/>
       </w:tblPr>
       <w:tcPr>
-        <w:shd w:color="ffffff"/>
+        <w:shd w:val="clear" w:color="ffffff"/>
         <w:tcBorders>
-          <w:top w:val="none"/>
-          <w:left w:val="none"/>
-          <w:bottom w:val="none"/>
+          <w:top w:val="none" w:color="000000" w:sz="4" w:space="0"/>
+          <w:left w:val="none" w:color="000000" w:sz="4" w:space="0"/>
+          <w:bottom w:val="none" w:color="000000" w:sz="4" w:space="0"/>
           <w:right w:val="single" w:color="000000" w:themeColor="accent3" w:themeTint="FE" w:sz="4" w:space="0"/>
         </w:tcBorders>
       </w:tcPr>
@@ -12598,10 +12803,10 @@
       <w:tcPr>
         <w:shd w:val="clear" w:color="ffffff" w:themeColor="light1" w:fill="ffffff" w:themeFill="light1"/>
         <w:tcBorders>
-          <w:top w:val="none"/>
-          <w:left w:val="none"/>
+          <w:top w:val="none" w:color="000000" w:sz="4" w:space="0"/>
+          <w:left w:val="none" w:color="000000" w:sz="4" w:space="0"/>
           <w:bottom w:val="single" w:color="000000" w:themeColor="accent3" w:themeTint="FE" w:sz="4" w:space="0"/>
-          <w:right w:val="none"/>
+          <w:right w:val="none" w:color="000000" w:sz="4" w:space="0"/>
         </w:tcBorders>
       </w:tcPr>
     </w:tblStylePr>
@@ -12621,12 +12826,12 @@
         <w:tblBorders/>
       </w:tblPr>
       <w:tcPr>
-        <w:shd w:color="ffffff"/>
+        <w:shd w:val="clear" w:color="ffffff"/>
         <w:tcBorders>
-          <w:top w:val="none"/>
+          <w:top w:val="none" w:color="000000" w:sz="4" w:space="0"/>
           <w:left w:val="single" w:color="000000" w:themeColor="accent3" w:themeTint="FE" w:sz="4" w:space="0"/>
-          <w:bottom w:val="none"/>
-          <w:right w:val="none"/>
+          <w:bottom w:val="none" w:color="000000" w:sz="4" w:space="0"/>
+          <w:right w:val="none" w:color="000000" w:sz="4" w:space="0"/>
         </w:tcBorders>
       </w:tcPr>
     </w:tblStylePr>
@@ -12649,9 +12854,9 @@
         <w:shd w:val="clear" w:color="ffffff" w:themeColor="light1" w:fill="ffffff" w:themeFill="light1"/>
         <w:tcBorders>
           <w:top w:val="single" w:color="000000" w:themeColor="accent3" w:themeTint="FE" w:sz="4" w:space="0"/>
-          <w:left w:val="none"/>
-          <w:bottom w:val="none"/>
-          <w:right w:val="none"/>
+          <w:left w:val="none" w:color="000000" w:sz="4" w:space="0"/>
+          <w:bottom w:val="none" w:color="000000" w:sz="4" w:space="0"/>
+          <w:right w:val="none" w:color="000000" w:sz="4" w:space="0"/>
         </w:tcBorders>
       </w:tcPr>
     </w:tblStylePr>
@@ -12721,9 +12926,9 @@
       </w:tcPr>
     </w:tblStylePr>
   </w:style>
-  <w:style w:type="table" w:styleId="65">
+  <w:style w:type="table" w:styleId="754">
     <w:name w:val="Grid Table 7 Colorful - Accent 4"/>
-    <w:basedOn w:val="666"/>
+    <w:basedOn w:val="889"/>
     <w:uiPriority w:val="99"/>
     <w:pPr>
       <w:pBdr/>
@@ -12825,11 +13030,11 @@
         <w:tblBorders/>
       </w:tblPr>
       <w:tcPr>
-        <w:shd w:color="ffffff"/>
+        <w:shd w:val="clear" w:color="ffffff"/>
         <w:tcBorders>
-          <w:top w:val="none"/>
-          <w:left w:val="none"/>
-          <w:bottom w:val="none"/>
+          <w:top w:val="none" w:color="000000" w:sz="4" w:space="0"/>
+          <w:left w:val="none" w:color="000000" w:sz="4" w:space="0"/>
+          <w:bottom w:val="none" w:color="000000" w:sz="4" w:space="0"/>
           <w:right w:val="single" w:color="000000" w:themeColor="accent4" w:themeTint="9A" w:sz="4" w:space="0"/>
         </w:tcBorders>
       </w:tcPr>
@@ -12852,10 +13057,10 @@
       <w:tcPr>
         <w:shd w:val="clear" w:color="ffffff" w:themeColor="light1" w:fill="ffffff" w:themeFill="light1"/>
         <w:tcBorders>
-          <w:top w:val="none"/>
-          <w:left w:val="none"/>
+          <w:top w:val="none" w:color="000000" w:sz="4" w:space="0"/>
+          <w:left w:val="none" w:color="000000" w:sz="4" w:space="0"/>
           <w:bottom w:val="single" w:color="000000" w:themeColor="accent4" w:themeTint="9A" w:sz="4" w:space="0"/>
-          <w:right w:val="none"/>
+          <w:right w:val="none" w:color="000000" w:sz="4" w:space="0"/>
         </w:tcBorders>
       </w:tcPr>
     </w:tblStylePr>
@@ -12875,12 +13080,12 @@
         <w:tblBorders/>
       </w:tblPr>
       <w:tcPr>
-        <w:shd w:color="ffffff"/>
+        <w:shd w:val="clear" w:color="ffffff"/>
         <w:tcBorders>
-          <w:top w:val="none"/>
+          <w:top w:val="none" w:color="000000" w:sz="4" w:space="0"/>
           <w:left w:val="single" w:color="000000" w:themeColor="accent4" w:themeTint="9A" w:sz="4" w:space="0"/>
-          <w:bottom w:val="none"/>
-          <w:right w:val="none"/>
+          <w:bottom w:val="none" w:color="000000" w:sz="4" w:space="0"/>
+          <w:right w:val="none" w:color="000000" w:sz="4" w:space="0"/>
         </w:tcBorders>
       </w:tcPr>
     </w:tblStylePr>
@@ -12903,9 +13108,9 @@
         <w:shd w:val="clear" w:color="ffffff" w:themeColor="light1" w:fill="ffffff" w:themeFill="light1"/>
         <w:tcBorders>
           <w:top w:val="single" w:color="000000" w:themeColor="accent4" w:themeTint="9A" w:sz="4" w:space="0"/>
-          <w:left w:val="none"/>
-          <w:bottom w:val="none"/>
-          <w:right w:val="none"/>
+          <w:left w:val="none" w:color="000000" w:sz="4" w:space="0"/>
+          <w:bottom w:val="none" w:color="000000" w:sz="4" w:space="0"/>
+          <w:right w:val="none" w:color="000000" w:sz="4" w:space="0"/>
         </w:tcBorders>
       </w:tcPr>
     </w:tblStylePr>
@@ -12975,9 +13180,9 @@
       </w:tcPr>
     </w:tblStylePr>
   </w:style>
-  <w:style w:type="table" w:styleId="66">
+  <w:style w:type="table" w:styleId="755">
     <w:name w:val="Grid Table 7 Colorful - Accent 5"/>
-    <w:basedOn w:val="666"/>
+    <w:basedOn w:val="889"/>
     <w:uiPriority w:val="99"/>
     <w:pPr>
       <w:pBdr/>
@@ -13079,11 +13284,11 @@
         <w:tblBorders/>
       </w:tblPr>
       <w:tcPr>
-        <w:shd w:color="ffffff"/>
+        <w:shd w:val="clear" w:color="ffffff"/>
         <w:tcBorders>
-          <w:top w:val="none"/>
-          <w:left w:val="none"/>
-          <w:bottom w:val="none"/>
+          <w:top w:val="none" w:color="000000" w:sz="4" w:space="0"/>
+          <w:left w:val="none" w:color="000000" w:sz="4" w:space="0"/>
+          <w:bottom w:val="none" w:color="000000" w:sz="4" w:space="0"/>
           <w:right w:val="single" w:color="000000" w:themeColor="accent5" w:themeTint="90" w:sz="4" w:space="0"/>
         </w:tcBorders>
       </w:tcPr>
@@ -13106,10 +13311,10 @@
       <w:tcPr>
         <w:shd w:val="clear" w:color="ffffff" w:themeColor="light1" w:fill="ffffff" w:themeFill="light1"/>
         <w:tcBorders>
-          <w:top w:val="none"/>
-          <w:left w:val="none"/>
+          <w:top w:val="none" w:color="000000" w:sz="4" w:space="0"/>
+          <w:left w:val="none" w:color="000000" w:sz="4" w:space="0"/>
           <w:bottom w:val="single" w:color="000000" w:themeColor="accent5" w:themeTint="90" w:sz="4" w:space="0"/>
-          <w:right w:val="none"/>
+          <w:right w:val="none" w:color="000000" w:sz="4" w:space="0"/>
         </w:tcBorders>
       </w:tcPr>
     </w:tblStylePr>
@@ -13129,12 +13334,12 @@
         <w:tblBorders/>
       </w:tblPr>
       <w:tcPr>
-        <w:shd w:color="ffffff"/>
+        <w:shd w:val="clear" w:color="ffffff"/>
         <w:tcBorders>
-          <w:top w:val="none"/>
+          <w:top w:val="none" w:color="000000" w:sz="4" w:space="0"/>
           <w:left w:val="single" w:color="000000" w:themeColor="accent5" w:themeTint="90" w:sz="4" w:space="0"/>
-          <w:bottom w:val="none"/>
-          <w:right w:val="none"/>
+          <w:bottom w:val="none" w:color="000000" w:sz="4" w:space="0"/>
+          <w:right w:val="none" w:color="000000" w:sz="4" w:space="0"/>
         </w:tcBorders>
       </w:tcPr>
     </w:tblStylePr>
@@ -13157,9 +13362,9 @@
         <w:shd w:val="clear" w:color="ffffff" w:themeColor="light1" w:fill="ffffff" w:themeFill="light1"/>
         <w:tcBorders>
           <w:top w:val="single" w:color="000000" w:themeColor="accent5" w:themeTint="90" w:sz="4" w:space="0"/>
-          <w:left w:val="none"/>
-          <w:bottom w:val="none"/>
-          <w:right w:val="none"/>
+          <w:left w:val="none" w:color="000000" w:sz="4" w:space="0"/>
+          <w:bottom w:val="none" w:color="000000" w:sz="4" w:space="0"/>
+          <w:right w:val="none" w:color="000000" w:sz="4" w:space="0"/>
         </w:tcBorders>
       </w:tcPr>
     </w:tblStylePr>
@@ -13229,9 +13434,9 @@
       </w:tcPr>
     </w:tblStylePr>
   </w:style>
-  <w:style w:type="table" w:styleId="67">
+  <w:style w:type="table" w:styleId="756">
     <w:name w:val="Grid Table 7 Colorful - Accent 6"/>
-    <w:basedOn w:val="666"/>
+    <w:basedOn w:val="889"/>
     <w:uiPriority w:val="99"/>
     <w:pPr>
       <w:pBdr/>
@@ -13333,11 +13538,11 @@
         <w:tblBorders/>
       </w:tblPr>
       <w:tcPr>
-        <w:shd w:color="ffffff"/>
+        <w:shd w:val="clear" w:color="ffffff"/>
         <w:tcBorders>
-          <w:top w:val="none"/>
-          <w:left w:val="none"/>
-          <w:bottom w:val="none"/>
+          <w:top w:val="none" w:color="000000" w:sz="4" w:space="0"/>
+          <w:left w:val="none" w:color="000000" w:sz="4" w:space="0"/>
+          <w:bottom w:val="none" w:color="000000" w:sz="4" w:space="0"/>
           <w:right w:val="single" w:color="000000" w:themeColor="accent6" w:themeTint="90" w:sz="4" w:space="0"/>
         </w:tcBorders>
       </w:tcPr>
@@ -13360,10 +13565,10 @@
       <w:tcPr>
         <w:shd w:val="clear" w:color="ffffff" w:themeColor="light1" w:fill="ffffff" w:themeFill="light1"/>
         <w:tcBorders>
-          <w:top w:val="none"/>
-          <w:left w:val="none"/>
+          <w:top w:val="none" w:color="000000" w:sz="4" w:space="0"/>
+          <w:left w:val="none" w:color="000000" w:sz="4" w:space="0"/>
           <w:bottom w:val="single" w:color="000000" w:themeColor="accent6" w:themeTint="90" w:sz="4" w:space="0"/>
-          <w:right w:val="none"/>
+          <w:right w:val="none" w:color="000000" w:sz="4" w:space="0"/>
         </w:tcBorders>
       </w:tcPr>
     </w:tblStylePr>
@@ -13383,12 +13588,12 @@
         <w:tblBorders/>
       </w:tblPr>
       <w:tcPr>
-        <w:shd w:color="ffffff"/>
+        <w:shd w:val="clear" w:color="ffffff"/>
         <w:tcBorders>
-          <w:top w:val="none"/>
+          <w:top w:val="none" w:color="000000" w:sz="4" w:space="0"/>
           <w:left w:val="single" w:color="000000" w:themeColor="accent6" w:themeTint="90" w:sz="4" w:space="0"/>
-          <w:bottom w:val="none"/>
-          <w:right w:val="none"/>
+          <w:bottom w:val="none" w:color="000000" w:sz="4" w:space="0"/>
+          <w:right w:val="none" w:color="000000" w:sz="4" w:space="0"/>
         </w:tcBorders>
       </w:tcPr>
     </w:tblStylePr>
@@ -13411,9 +13616,9 @@
         <w:shd w:val="clear" w:color="ffffff" w:themeColor="light1" w:fill="ffffff" w:themeFill="light1"/>
         <w:tcBorders>
           <w:top w:val="single" w:color="000000" w:themeColor="accent6" w:themeTint="90" w:sz="4" w:space="0"/>
-          <w:left w:val="none"/>
-          <w:bottom w:val="none"/>
-          <w:right w:val="none"/>
+          <w:left w:val="none" w:color="000000" w:sz="4" w:space="0"/>
+          <w:bottom w:val="none" w:color="000000" w:sz="4" w:space="0"/>
+          <w:right w:val="none" w:color="000000" w:sz="4" w:space="0"/>
         </w:tcBorders>
       </w:tcPr>
     </w:tblStylePr>
@@ -13483,9 +13688,9 @@
       </w:tcPr>
     </w:tblStylePr>
   </w:style>
-  <w:style w:type="table" w:styleId="68">
+  <w:style w:type="table" w:styleId="757">
     <w:name w:val="List Table 1 Light"/>
-    <w:basedOn w:val="666"/>
+    <w:basedOn w:val="889"/>
     <w:uiPriority w:val="99"/>
     <w:pPr>
       <w:pBdr/>
@@ -13699,9 +13904,9 @@
       </w:tcPr>
     </w:tblStylePr>
   </w:style>
-  <w:style w:type="table" w:styleId="69">
+  <w:style w:type="table" w:styleId="758">
     <w:name w:val="List Table 1 Light - Accent 1"/>
-    <w:basedOn w:val="666"/>
+    <w:basedOn w:val="889"/>
     <w:uiPriority w:val="99"/>
     <w:pPr>
       <w:pBdr/>
@@ -13915,9 +14120,9 @@
       </w:tcPr>
     </w:tblStylePr>
   </w:style>
-  <w:style w:type="table" w:styleId="70">
+  <w:style w:type="table" w:styleId="759">
     <w:name w:val="List Table 1 Light - Accent 2"/>
-    <w:basedOn w:val="666"/>
+    <w:basedOn w:val="889"/>
     <w:uiPriority w:val="99"/>
     <w:pPr>
       <w:pBdr/>
@@ -14131,9 +14336,9 @@
       </w:tcPr>
     </w:tblStylePr>
   </w:style>
-  <w:style w:type="table" w:styleId="71">
+  <w:style w:type="table" w:styleId="760">
     <w:name w:val="List Table 1 Light - Accent 3"/>
-    <w:basedOn w:val="666"/>
+    <w:basedOn w:val="889"/>
     <w:uiPriority w:val="99"/>
     <w:pPr>
       <w:pBdr/>
@@ -14347,9 +14552,9 @@
       </w:tcPr>
     </w:tblStylePr>
   </w:style>
-  <w:style w:type="table" w:styleId="72">
+  <w:style w:type="table" w:styleId="761">
     <w:name w:val="List Table 1 Light - Accent 4"/>
-    <w:basedOn w:val="666"/>
+    <w:basedOn w:val="889"/>
     <w:uiPriority w:val="99"/>
     <w:pPr>
       <w:pBdr/>
@@ -14563,9 +14768,9 @@
       </w:tcPr>
     </w:tblStylePr>
   </w:style>
-  <w:style w:type="table" w:styleId="73">
+  <w:style w:type="table" w:styleId="762">
     <w:name w:val="List Table 1 Light - Accent 5"/>
-    <w:basedOn w:val="666"/>
+    <w:basedOn w:val="889"/>
     <w:uiPriority w:val="99"/>
     <w:pPr>
       <w:pBdr/>
@@ -14779,9 +14984,9 @@
       </w:tcPr>
     </w:tblStylePr>
   </w:style>
-  <w:style w:type="table" w:styleId="74">
+  <w:style w:type="table" w:styleId="763">
     <w:name w:val="List Table 1 Light - Accent 6"/>
-    <w:basedOn w:val="666"/>
+    <w:basedOn w:val="889"/>
     <w:uiPriority w:val="99"/>
     <w:pPr>
       <w:pBdr/>
@@ -14995,9 +15200,9 @@
       </w:tcPr>
     </w:tblStylePr>
   </w:style>
-  <w:style w:type="table" w:styleId="75">
+  <w:style w:type="table" w:styleId="764">
     <w:name w:val="List Table 2"/>
-    <w:basedOn w:val="666"/>
+    <w:basedOn w:val="889"/>
     <w:uiPriority w:val="99"/>
     <w:pPr>
       <w:pBdr/>
@@ -15233,9 +15438,9 @@
       </w:tcPr>
     </w:tblStylePr>
   </w:style>
-  <w:style w:type="table" w:styleId="76">
+  <w:style w:type="table" w:styleId="765">
     <w:name w:val="List Table 2 - Accent 1"/>
-    <w:basedOn w:val="666"/>
+    <w:basedOn w:val="889"/>
     <w:uiPriority w:val="99"/>
     <w:pPr>
       <w:pBdr/>
@@ -15471,9 +15676,9 @@
       </w:tcPr>
     </w:tblStylePr>
   </w:style>
-  <w:style w:type="table" w:styleId="77">
+  <w:style w:type="table" w:styleId="766">
     <w:name w:val="List Table 2 - Accent 2"/>
-    <w:basedOn w:val="666"/>
+    <w:basedOn w:val="889"/>
     <w:uiPriority w:val="99"/>
     <w:pPr>
       <w:pBdr/>
@@ -15709,9 +15914,9 @@
       </w:tcPr>
     </w:tblStylePr>
   </w:style>
-  <w:style w:type="table" w:styleId="78">
+  <w:style w:type="table" w:styleId="767">
     <w:name w:val="List Table 2 - Accent 3"/>
-    <w:basedOn w:val="666"/>
+    <w:basedOn w:val="889"/>
     <w:uiPriority w:val="99"/>
     <w:pPr>
       <w:pBdr/>
@@ -15947,9 +16152,9 @@
       </w:tcPr>
     </w:tblStylePr>
   </w:style>
-  <w:style w:type="table" w:styleId="79">
+  <w:style w:type="table" w:styleId="768">
     <w:name w:val="List Table 2 - Accent 4"/>
-    <w:basedOn w:val="666"/>
+    <w:basedOn w:val="889"/>
     <w:uiPriority w:val="99"/>
     <w:pPr>
       <w:pBdr/>
@@ -16185,9 +16390,9 @@
       </w:tcPr>
     </w:tblStylePr>
   </w:style>
-  <w:style w:type="table" w:styleId="80">
+  <w:style w:type="table" w:styleId="769">
     <w:name w:val="List Table 2 - Accent 5"/>
-    <w:basedOn w:val="666"/>
+    <w:basedOn w:val="889"/>
     <w:uiPriority w:val="99"/>
     <w:pPr>
       <w:pBdr/>
@@ -16423,9 +16628,9 @@
       </w:tcPr>
     </w:tblStylePr>
   </w:style>
-  <w:style w:type="table" w:styleId="81">
+  <w:style w:type="table" w:styleId="770">
     <w:name w:val="List Table 2 - Accent 6"/>
-    <w:basedOn w:val="666"/>
+    <w:basedOn w:val="889"/>
     <w:uiPriority w:val="99"/>
     <w:pPr>
       <w:pBdr/>
@@ -16661,9 +16866,9 @@
       </w:tcPr>
     </w:tblStylePr>
   </w:style>
-  <w:style w:type="table" w:styleId="82">
+  <w:style w:type="table" w:styleId="771">
     <w:name w:val="List Table 3"/>
-    <w:basedOn w:val="666"/>
+    <w:basedOn w:val="889"/>
     <w:uiPriority w:val="99"/>
     <w:pPr>
       <w:pBdr/>
@@ -16889,9 +17094,9 @@
       </w:tcPr>
     </w:tblStylePr>
   </w:style>
-  <w:style w:type="table" w:styleId="83">
+  <w:style w:type="table" w:styleId="772">
     <w:name w:val="List Table 3 - Accent 1"/>
-    <w:basedOn w:val="666"/>
+    <w:basedOn w:val="889"/>
     <w:uiPriority w:val="99"/>
     <w:pPr>
       <w:pBdr/>
@@ -17117,9 +17322,9 @@
       </w:tcPr>
     </w:tblStylePr>
   </w:style>
-  <w:style w:type="table" w:styleId="84">
+  <w:style w:type="table" w:styleId="773">
     <w:name w:val="List Table 3 - Accent 2"/>
-    <w:basedOn w:val="666"/>
+    <w:basedOn w:val="889"/>
     <w:uiPriority w:val="99"/>
     <w:pPr>
       <w:pBdr/>
@@ -17345,9 +17550,9 @@
       </w:tcPr>
     </w:tblStylePr>
   </w:style>
-  <w:style w:type="table" w:styleId="85">
+  <w:style w:type="table" w:styleId="774">
     <w:name w:val="List Table 3 - Accent 3"/>
-    <w:basedOn w:val="666"/>
+    <w:basedOn w:val="889"/>
     <w:uiPriority w:val="99"/>
     <w:pPr>
       <w:pBdr/>
@@ -17573,9 +17778,9 @@
       </w:tcPr>
     </w:tblStylePr>
   </w:style>
-  <w:style w:type="table" w:styleId="86">
+  <w:style w:type="table" w:styleId="775">
     <w:name w:val="List Table 3 - Accent 4"/>
-    <w:basedOn w:val="666"/>
+    <w:basedOn w:val="889"/>
     <w:uiPriority w:val="99"/>
     <w:pPr>
       <w:pBdr/>
@@ -17801,9 +18006,9 @@
       </w:tcPr>
     </w:tblStylePr>
   </w:style>
-  <w:style w:type="table" w:styleId="87">
+  <w:style w:type="table" w:styleId="776">
     <w:name w:val="List Table 3 - Accent 5"/>
-    <w:basedOn w:val="666"/>
+    <w:basedOn w:val="889"/>
     <w:uiPriority w:val="99"/>
     <w:pPr>
       <w:pBdr/>
@@ -18029,9 +18234,9 @@
       </w:tcPr>
     </w:tblStylePr>
   </w:style>
-  <w:style w:type="table" w:styleId="88">
+  <w:style w:type="table" w:styleId="777">
     <w:name w:val="List Table 3 - Accent 6"/>
-    <w:basedOn w:val="666"/>
+    <w:basedOn w:val="889"/>
     <w:uiPriority w:val="99"/>
     <w:pPr>
       <w:pBdr/>
@@ -18257,9 +18462,9 @@
       </w:tcPr>
     </w:tblStylePr>
   </w:style>
-  <w:style w:type="table" w:styleId="89">
+  <w:style w:type="table" w:styleId="778">
     <w:name w:val="List Table 4"/>
-    <w:basedOn w:val="666"/>
+    <w:basedOn w:val="889"/>
     <w:uiPriority w:val="99"/>
     <w:pPr>
       <w:pBdr/>
@@ -18482,9 +18687,9 @@
       </w:tcPr>
     </w:tblStylePr>
   </w:style>
-  <w:style w:type="table" w:styleId="90">
+  <w:style w:type="table" w:styleId="779">
     <w:name w:val="List Table 4 - Accent 1"/>
-    <w:basedOn w:val="666"/>
+    <w:basedOn w:val="889"/>
     <w:uiPriority w:val="99"/>
     <w:pPr>
       <w:pBdr/>
@@ -18707,9 +18912,9 @@
       </w:tcPr>
     </w:tblStylePr>
   </w:style>
-  <w:style w:type="table" w:styleId="91">
+  <w:style w:type="table" w:styleId="780">
     <w:name w:val="List Table 4 - Accent 2"/>
-    <w:basedOn w:val="666"/>
+    <w:basedOn w:val="889"/>
     <w:uiPriority w:val="99"/>
     <w:pPr>
       <w:pBdr/>
@@ -18932,9 +19137,9 @@
       </w:tcPr>
     </w:tblStylePr>
   </w:style>
-  <w:style w:type="table" w:styleId="92">
+  <w:style w:type="table" w:styleId="781">
     <w:name w:val="List Table 4 - Accent 3"/>
-    <w:basedOn w:val="666"/>
+    <w:basedOn w:val="889"/>
     <w:uiPriority w:val="99"/>
     <w:pPr>
       <w:pBdr/>
@@ -19157,9 +19362,9 @@
       </w:tcPr>
     </w:tblStylePr>
   </w:style>
-  <w:style w:type="table" w:styleId="93">
+  <w:style w:type="table" w:styleId="782">
     <w:name w:val="List Table 4 - Accent 4"/>
-    <w:basedOn w:val="666"/>
+    <w:basedOn w:val="889"/>
     <w:uiPriority w:val="99"/>
     <w:pPr>
       <w:pBdr/>
@@ -19382,9 +19587,9 @@
       </w:tcPr>
     </w:tblStylePr>
   </w:style>
-  <w:style w:type="table" w:styleId="94">
+  <w:style w:type="table" w:styleId="783">
     <w:name w:val="List Table 4 - Accent 5"/>
-    <w:basedOn w:val="666"/>
+    <w:basedOn w:val="889"/>
     <w:uiPriority w:val="99"/>
     <w:pPr>
       <w:pBdr/>
@@ -19607,9 +19812,9 @@
       </w:tcPr>
     </w:tblStylePr>
   </w:style>
-  <w:style w:type="table" w:styleId="95">
+  <w:style w:type="table" w:styleId="784">
     <w:name w:val="List Table 4 - Accent 6"/>
-    <w:basedOn w:val="666"/>
+    <w:basedOn w:val="889"/>
     <w:uiPriority w:val="99"/>
     <w:pPr>
       <w:pBdr/>
@@ -19832,9 +20037,9 @@
       </w:tcPr>
     </w:tblStylePr>
   </w:style>
-  <w:style w:type="table" w:styleId="96">
+  <w:style w:type="table" w:styleId="785">
     <w:name w:val="List Table 5 Dark"/>
-    <w:basedOn w:val="666"/>
+    <w:basedOn w:val="889"/>
     <w:uiPriority w:val="99"/>
     <w:pPr>
       <w:pBdr/>
@@ -20074,9 +20279,9 @@
       </w:tcPr>
     </w:tblStylePr>
   </w:style>
-  <w:style w:type="table" w:styleId="97">
+  <w:style w:type="table" w:styleId="786">
     <w:name w:val="List Table 5 Dark - Accent 1"/>
-    <w:basedOn w:val="666"/>
+    <w:basedOn w:val="889"/>
     <w:uiPriority w:val="99"/>
     <w:pPr>
       <w:pBdr/>
@@ -20316,9 +20521,9 @@
       </w:tcPr>
     </w:tblStylePr>
   </w:style>
-  <w:style w:type="table" w:styleId="98">
+  <w:style w:type="table" w:styleId="787">
     <w:name w:val="List Table 5 Dark - Accent 2"/>
-    <w:basedOn w:val="666"/>
+    <w:basedOn w:val="889"/>
     <w:uiPriority w:val="99"/>
     <w:pPr>
       <w:pBdr/>
@@ -20558,9 +20763,9 @@
       </w:tcPr>
     </w:tblStylePr>
   </w:style>
-  <w:style w:type="table" w:styleId="99">
+  <w:style w:type="table" w:styleId="788">
     <w:name w:val="List Table 5 Dark - Accent 3"/>
-    <w:basedOn w:val="666"/>
+    <w:basedOn w:val="889"/>
     <w:uiPriority w:val="99"/>
     <w:pPr>
       <w:pBdr/>
@@ -20800,9 +21005,9 @@
       </w:tcPr>
     </w:tblStylePr>
   </w:style>
-  <w:style w:type="table" w:styleId="100">
+  <w:style w:type="table" w:styleId="789">
     <w:name w:val="List Table 5 Dark - Accent 4"/>
-    <w:basedOn w:val="666"/>
+    <w:basedOn w:val="889"/>
     <w:uiPriority w:val="99"/>
     <w:pPr>
       <w:pBdr/>
@@ -21042,9 +21247,9 @@
       </w:tcPr>
     </w:tblStylePr>
   </w:style>
-  <w:style w:type="table" w:styleId="101">
+  <w:style w:type="table" w:styleId="790">
     <w:name w:val="List Table 5 Dark - Accent 5"/>
-    <w:basedOn w:val="666"/>
+    <w:basedOn w:val="889"/>
     <w:uiPriority w:val="99"/>
     <w:pPr>
       <w:pBdr/>
@@ -21284,9 +21489,9 @@
       </w:tcPr>
     </w:tblStylePr>
   </w:style>
-  <w:style w:type="table" w:styleId="102">
+  <w:style w:type="table" w:styleId="791">
     <w:name w:val="List Table 5 Dark - Accent 6"/>
-    <w:basedOn w:val="666"/>
+    <w:basedOn w:val="889"/>
     <w:uiPriority w:val="99"/>
     <w:pPr>
       <w:pBdr/>
@@ -21526,9 +21731,9 @@
       </w:tcPr>
     </w:tblStylePr>
   </w:style>
-  <w:style w:type="table" w:styleId="103">
+  <w:style w:type="table" w:styleId="792">
     <w:name w:val="List Table 6 Colorful"/>
-    <w:basedOn w:val="666"/>
+    <w:basedOn w:val="889"/>
     <w:uiPriority w:val="99"/>
     <w:pPr>
       <w:pBdr/>
@@ -21749,9 +21954,9 @@
       </w:tcPr>
     </w:tblStylePr>
   </w:style>
-  <w:style w:type="table" w:styleId="104">
+  <w:style w:type="table" w:styleId="793">
     <w:name w:val="List Table 6 Colorful - Accent 1"/>
-    <w:basedOn w:val="666"/>
+    <w:basedOn w:val="889"/>
     <w:uiPriority w:val="99"/>
     <w:pPr>
       <w:pBdr/>
@@ -21972,9 +22177,9 @@
       </w:tcPr>
     </w:tblStylePr>
   </w:style>
-  <w:style w:type="table" w:styleId="105">
+  <w:style w:type="table" w:styleId="794">
     <w:name w:val="List Table 6 Colorful - Accent 2"/>
-    <w:basedOn w:val="666"/>
+    <w:basedOn w:val="889"/>
     <w:uiPriority w:val="99"/>
     <w:pPr>
       <w:pBdr/>
@@ -22195,9 +22400,9 @@
       </w:tcPr>
     </w:tblStylePr>
   </w:style>
-  <w:style w:type="table" w:styleId="106">
+  <w:style w:type="table" w:styleId="795">
     <w:name w:val="List Table 6 Colorful - Accent 3"/>
-    <w:basedOn w:val="666"/>
+    <w:basedOn w:val="889"/>
     <w:uiPriority w:val="99"/>
     <w:pPr>
       <w:pBdr/>
@@ -22418,9 +22623,9 @@
       </w:tcPr>
     </w:tblStylePr>
   </w:style>
-  <w:style w:type="table" w:styleId="107">
+  <w:style w:type="table" w:styleId="796">
     <w:name w:val="List Table 6 Colorful - Accent 4"/>
-    <w:basedOn w:val="666"/>
+    <w:basedOn w:val="889"/>
     <w:uiPriority w:val="99"/>
     <w:pPr>
       <w:pBdr/>
@@ -22641,9 +22846,9 @@
       </w:tcPr>
     </w:tblStylePr>
   </w:style>
-  <w:style w:type="table" w:styleId="108">
+  <w:style w:type="table" w:styleId="797">
     <w:name w:val="List Table 6 Colorful - Accent 5"/>
-    <w:basedOn w:val="666"/>
+    <w:basedOn w:val="889"/>
     <w:uiPriority w:val="99"/>
     <w:pPr>
       <w:pBdr/>
@@ -22864,9 +23069,9 @@
       </w:tcPr>
     </w:tblStylePr>
   </w:style>
-  <w:style w:type="table" w:styleId="109">
+  <w:style w:type="table" w:styleId="798">
     <w:name w:val="List Table 6 Colorful - Accent 6"/>
-    <w:basedOn w:val="666"/>
+    <w:basedOn w:val="889"/>
     <w:uiPriority w:val="99"/>
     <w:pPr>
       <w:pBdr/>
@@ -23087,9 +23292,9 @@
       </w:tcPr>
     </w:tblStylePr>
   </w:style>
-  <w:style w:type="table" w:styleId="110">
+  <w:style w:type="table" w:styleId="799">
     <w:name w:val="List Table 7 Colorful"/>
-    <w:basedOn w:val="666"/>
+    <w:basedOn w:val="889"/>
     <w:uiPriority w:val="99"/>
     <w:pPr>
       <w:pBdr/>
@@ -23188,11 +23393,11 @@
         <w:tblBorders/>
       </w:tblPr>
       <w:tcPr>
-        <w:shd w:color="ffffff"/>
+        <w:shd w:val="clear" w:color="ffffff"/>
         <w:tcBorders>
-          <w:top w:val="none"/>
-          <w:left w:val="none"/>
-          <w:bottom w:val="none"/>
+          <w:top w:val="none" w:color="000000" w:sz="4" w:space="0"/>
+          <w:left w:val="none" w:color="000000" w:sz="4" w:space="0"/>
+          <w:bottom w:val="none" w:color="000000" w:sz="4" w:space="0"/>
           <w:right w:val="single" w:color="000000" w:themeColor="text1" w:themeTint="80" w:sz="4" w:space="0"/>
         </w:tcBorders>
       </w:tcPr>
@@ -23215,10 +23420,10 @@
       <w:tcPr>
         <w:shd w:val="clear" w:color="ffffff" w:themeColor="light1" w:fill="ffffff" w:themeFill="light1"/>
         <w:tcBorders>
-          <w:top w:val="none"/>
-          <w:left w:val="none"/>
+          <w:top w:val="none" w:color="000000" w:sz="4" w:space="0"/>
+          <w:left w:val="none" w:color="000000" w:sz="4" w:space="0"/>
           <w:bottom w:val="single" w:color="000000" w:themeColor="text1" w:themeTint="80" w:sz="4" w:space="0"/>
-          <w:right w:val="none"/>
+          <w:right w:val="none" w:color="000000" w:sz="4" w:space="0"/>
         </w:tcBorders>
       </w:tcPr>
     </w:tblStylePr>
@@ -23238,12 +23443,12 @@
         <w:tblBorders/>
       </w:tblPr>
       <w:tcPr>
-        <w:shd w:color="ffffff"/>
+        <w:shd w:val="clear" w:color="ffffff"/>
         <w:tcBorders>
-          <w:top w:val="none"/>
+          <w:top w:val="none" w:color="000000" w:sz="4" w:space="0"/>
           <w:left w:val="single" w:color="000000" w:themeColor="text1" w:themeTint="80" w:sz="4" w:space="0"/>
-          <w:bottom w:val="none"/>
-          <w:right w:val="none"/>
+          <w:bottom w:val="none" w:color="000000" w:sz="4" w:space="0"/>
+          <w:right w:val="none" w:color="000000" w:sz="4" w:space="0"/>
         </w:tcBorders>
       </w:tcPr>
     </w:tblStylePr>
@@ -23266,9 +23471,9 @@
         <w:shd w:val="clear" w:color="ffffff" w:themeColor="light1" w:fill="ffffff" w:themeFill="light1"/>
         <w:tcBorders>
           <w:top w:val="single" w:color="000000" w:themeColor="text1" w:themeTint="80" w:sz="4" w:space="0"/>
-          <w:left w:val="none"/>
-          <w:bottom w:val="none"/>
-          <w:right w:val="none"/>
+          <w:left w:val="none" w:color="000000" w:sz="4" w:space="0"/>
+          <w:bottom w:val="none" w:color="000000" w:sz="4" w:space="0"/>
+          <w:right w:val="none" w:color="000000" w:sz="4" w:space="0"/>
         </w:tcBorders>
       </w:tcPr>
     </w:tblStylePr>
@@ -23343,9 +23548,9 @@
       </w:tcPr>
     </w:tblStylePr>
   </w:style>
-  <w:style w:type="table" w:styleId="111">
+  <w:style w:type="table" w:styleId="800">
     <w:name w:val="List Table 7 Colorful - Accent 1"/>
-    <w:basedOn w:val="666"/>
+    <w:basedOn w:val="889"/>
     <w:uiPriority w:val="99"/>
     <w:pPr>
       <w:pBdr/>
@@ -23444,11 +23649,11 @@
         <w:tblBorders/>
       </w:tblPr>
       <w:tcPr>
-        <w:shd w:color="ffffff"/>
+        <w:shd w:val="clear" w:color="ffffff"/>
         <w:tcBorders>
-          <w:top w:val="none"/>
-          <w:left w:val="none"/>
-          <w:bottom w:val="none"/>
+          <w:top w:val="none" w:color="000000" w:sz="4" w:space="0"/>
+          <w:left w:val="none" w:color="000000" w:sz="4" w:space="0"/>
+          <w:bottom w:val="none" w:color="000000" w:sz="4" w:space="0"/>
           <w:right w:val="single" w:color="000000" w:themeColor="accent1" w:sz="4" w:space="0"/>
         </w:tcBorders>
       </w:tcPr>
@@ -23471,10 +23676,10 @@
       <w:tcPr>
         <w:shd w:val="clear" w:color="ffffff" w:themeColor="light1" w:fill="ffffff" w:themeFill="light1"/>
         <w:tcBorders>
-          <w:top w:val="none"/>
-          <w:left w:val="none"/>
+          <w:top w:val="none" w:color="000000" w:sz="4" w:space="0"/>
+          <w:left w:val="none" w:color="000000" w:sz="4" w:space="0"/>
           <w:bottom w:val="single" w:color="000000" w:themeColor="accent1" w:sz="4" w:space="0"/>
-          <w:right w:val="none"/>
+          <w:right w:val="none" w:color="000000" w:sz="4" w:space="0"/>
         </w:tcBorders>
       </w:tcPr>
     </w:tblStylePr>
@@ -23494,12 +23699,12 @@
         <w:tblBorders/>
       </w:tblPr>
       <w:tcPr>
-        <w:shd w:color="ffffff"/>
+        <w:shd w:val="clear" w:color="ffffff"/>
         <w:tcBorders>
-          <w:top w:val="none"/>
+          <w:top w:val="none" w:color="000000" w:sz="4" w:space="0"/>
           <w:left w:val="single" w:color="000000" w:themeColor="accent1" w:sz="4" w:space="0"/>
-          <w:bottom w:val="none"/>
-          <w:right w:val="none"/>
+          <w:bottom w:val="none" w:color="000000" w:sz="4" w:space="0"/>
+          <w:right w:val="none" w:color="000000" w:sz="4" w:space="0"/>
         </w:tcBorders>
       </w:tcPr>
     </w:tblStylePr>
@@ -23522,9 +23727,9 @@
         <w:shd w:val="clear" w:color="ffffff" w:themeColor="light1" w:fill="ffffff" w:themeFill="light1"/>
         <w:tcBorders>
           <w:top w:val="single" w:color="000000" w:themeColor="accent1" w:sz="4" w:space="0"/>
-          <w:left w:val="none"/>
-          <w:bottom w:val="none"/>
-          <w:right w:val="none"/>
+          <w:left w:val="none" w:color="000000" w:sz="4" w:space="0"/>
+          <w:bottom w:val="none" w:color="000000" w:sz="4" w:space="0"/>
+          <w:right w:val="none" w:color="000000" w:sz="4" w:space="0"/>
         </w:tcBorders>
       </w:tcPr>
     </w:tblStylePr>
@@ -23599,9 +23804,9 @@
       </w:tcPr>
     </w:tblStylePr>
   </w:style>
-  <w:style w:type="table" w:styleId="112">
+  <w:style w:type="table" w:styleId="801">
     <w:name w:val="List Table 7 Colorful - Accent 2"/>
-    <w:basedOn w:val="666"/>
+    <w:basedOn w:val="889"/>
     <w:uiPriority w:val="99"/>
     <w:pPr>
       <w:pBdr/>
@@ -23700,11 +23905,11 @@
         <w:tblBorders/>
       </w:tblPr>
       <w:tcPr>
-        <w:shd w:color="ffffff"/>
+        <w:shd w:val="clear" w:color="ffffff"/>
         <w:tcBorders>
-          <w:top w:val="none"/>
-          <w:left w:val="none"/>
-          <w:bottom w:val="none"/>
+          <w:top w:val="none" w:color="000000" w:sz="4" w:space="0"/>
+          <w:left w:val="none" w:color="000000" w:sz="4" w:space="0"/>
+          <w:bottom w:val="none" w:color="000000" w:sz="4" w:space="0"/>
           <w:right w:val="single" w:color="000000" w:themeColor="accent2" w:themeTint="97" w:sz="4" w:space="0"/>
         </w:tcBorders>
       </w:tcPr>
@@ -23727,10 +23932,10 @@
       <w:tcPr>
         <w:shd w:val="clear" w:color="ffffff" w:themeColor="light1" w:fill="ffffff" w:themeFill="light1"/>
         <w:tcBorders>
-          <w:top w:val="none"/>
-          <w:left w:val="none"/>
+          <w:top w:val="none" w:color="000000" w:sz="4" w:space="0"/>
+          <w:left w:val="none" w:color="000000" w:sz="4" w:space="0"/>
           <w:bottom w:val="single" w:color="000000" w:themeColor="accent2" w:themeTint="97" w:sz="4" w:space="0"/>
-          <w:right w:val="none"/>
+          <w:right w:val="none" w:color="000000" w:sz="4" w:space="0"/>
         </w:tcBorders>
       </w:tcPr>
     </w:tblStylePr>
@@ -23750,12 +23955,12 @@
         <w:tblBorders/>
       </w:tblPr>
       <w:tcPr>
-        <w:shd w:color="ffffff"/>
+        <w:shd w:val="clear" w:color="ffffff"/>
         <w:tcBorders>
-          <w:top w:val="none"/>
+          <w:top w:val="none" w:color="000000" w:sz="4" w:space="0"/>
           <w:left w:val="single" w:color="000000" w:themeColor="accent2" w:themeTint="97" w:sz="4" w:space="0"/>
-          <w:bottom w:val="none"/>
-          <w:right w:val="none"/>
+          <w:bottom w:val="none" w:color="000000" w:sz="4" w:space="0"/>
+          <w:right w:val="none" w:color="000000" w:sz="4" w:space="0"/>
         </w:tcBorders>
       </w:tcPr>
     </w:tblStylePr>
@@ -23778,9 +23983,9 @@
         <w:shd w:val="clear" w:color="ffffff" w:themeColor="light1" w:fill="ffffff" w:themeFill="light1"/>
         <w:tcBorders>
           <w:top w:val="single" w:color="000000" w:themeColor="accent2" w:themeTint="97" w:sz="4" w:space="0"/>
-          <w:left w:val="none"/>
-          <w:bottom w:val="none"/>
-          <w:right w:val="none"/>
+          <w:left w:val="none" w:color="000000" w:sz="4" w:space="0"/>
+          <w:bottom w:val="none" w:color="000000" w:sz="4" w:space="0"/>
+          <w:right w:val="none" w:color="000000" w:sz="4" w:space="0"/>
         </w:tcBorders>
       </w:tcPr>
     </w:tblStylePr>
@@ -23855,9 +24060,9 @@
       </w:tcPr>
     </w:tblStylePr>
   </w:style>
-  <w:style w:type="table" w:styleId="113">
+  <w:style w:type="table" w:styleId="802">
     <w:name w:val="List Table 7 Colorful - Accent 3"/>
-    <w:basedOn w:val="666"/>
+    <w:basedOn w:val="889"/>
     <w:uiPriority w:val="99"/>
     <w:pPr>
       <w:pBdr/>
@@ -23956,11 +24161,11 @@
         <w:tblBorders/>
       </w:tblPr>
       <w:tcPr>
-        <w:shd w:color="ffffff"/>
+        <w:shd w:val="clear" w:color="ffffff"/>
         <w:tcBorders>
-          <w:top w:val="none"/>
-          <w:left w:val="none"/>
-          <w:bottom w:val="none"/>
+          <w:top w:val="none" w:color="000000" w:sz="4" w:space="0"/>
+          <w:left w:val="none" w:color="000000" w:sz="4" w:space="0"/>
+          <w:bottom w:val="none" w:color="000000" w:sz="4" w:space="0"/>
           <w:right w:val="single" w:color="000000" w:themeColor="accent3" w:themeTint="98" w:sz="4" w:space="0"/>
         </w:tcBorders>
       </w:tcPr>
@@ -23983,10 +24188,10 @@
       <w:tcPr>
         <w:shd w:val="clear" w:color="ffffff" w:themeColor="light1" w:fill="ffffff" w:themeFill="light1"/>
         <w:tcBorders>
-          <w:top w:val="none"/>
-          <w:left w:val="none"/>
+          <w:top w:val="none" w:color="000000" w:sz="4" w:space="0"/>
+          <w:left w:val="none" w:color="000000" w:sz="4" w:space="0"/>
           <w:bottom w:val="single" w:color="000000" w:themeColor="accent3" w:themeTint="98" w:sz="4" w:space="0"/>
-          <w:right w:val="none"/>
+          <w:right w:val="none" w:color="000000" w:sz="4" w:space="0"/>
         </w:tcBorders>
       </w:tcPr>
     </w:tblStylePr>
@@ -24006,12 +24211,12 @@
         <w:tblBorders/>
       </w:tblPr>
       <w:tcPr>
-        <w:shd w:color="ffffff"/>
+        <w:shd w:val="clear" w:color="ffffff"/>
         <w:tcBorders>
-          <w:top w:val="none"/>
+          <w:top w:val="none" w:color="000000" w:sz="4" w:space="0"/>
           <w:left w:val="single" w:color="000000" w:themeColor="accent3" w:themeTint="98" w:sz="4" w:space="0"/>
-          <w:bottom w:val="none"/>
-          <w:right w:val="none"/>
+          <w:bottom w:val="none" w:color="000000" w:sz="4" w:space="0"/>
+          <w:right w:val="none" w:color="000000" w:sz="4" w:space="0"/>
         </w:tcBorders>
       </w:tcPr>
     </w:tblStylePr>
@@ -24034,9 +24239,9 @@
         <w:shd w:val="clear" w:color="ffffff" w:themeColor="light1" w:fill="ffffff" w:themeFill="light1"/>
         <w:tcBorders>
           <w:top w:val="single" w:color="000000" w:themeColor="accent3" w:themeTint="98" w:sz="4" w:space="0"/>
-          <w:left w:val="none"/>
-          <w:bottom w:val="none"/>
-          <w:right w:val="none"/>
+          <w:left w:val="none" w:color="000000" w:sz="4" w:space="0"/>
+          <w:bottom w:val="none" w:color="000000" w:sz="4" w:space="0"/>
+          <w:right w:val="none" w:color="000000" w:sz="4" w:space="0"/>
         </w:tcBorders>
       </w:tcPr>
     </w:tblStylePr>
@@ -24111,9 +24316,9 @@
       </w:tcPr>
     </w:tblStylePr>
   </w:style>
-  <w:style w:type="table" w:styleId="114">
+  <w:style w:type="table" w:styleId="803">
     <w:name w:val="List Table 7 Colorful - Accent 4"/>
-    <w:basedOn w:val="666"/>
+    <w:basedOn w:val="889"/>
     <w:uiPriority w:val="99"/>
     <w:pPr>
       <w:pBdr/>
@@ -24212,11 +24417,11 @@
         <w:tblBorders/>
       </w:tblPr>
       <w:tcPr>
-        <w:shd w:color="ffffff"/>
+        <w:shd w:val="clear" w:color="ffffff"/>
         <w:tcBorders>
-          <w:top w:val="none"/>
-          <w:left w:val="none"/>
-          <w:bottom w:val="none"/>
+          <w:top w:val="none" w:color="000000" w:sz="4" w:space="0"/>
+          <w:left w:val="none" w:color="000000" w:sz="4" w:space="0"/>
+          <w:bottom w:val="none" w:color="000000" w:sz="4" w:space="0"/>
           <w:right w:val="single" w:color="000000" w:themeColor="accent4" w:themeTint="9A" w:sz="4" w:space="0"/>
         </w:tcBorders>
       </w:tcPr>
@@ -24239,10 +24444,10 @@
       <w:tcPr>
         <w:shd w:val="clear" w:color="ffffff" w:themeColor="light1" w:fill="ffffff" w:themeFill="light1"/>
         <w:tcBorders>
-          <w:top w:val="none"/>
-          <w:left w:val="none"/>
+          <w:top w:val="none" w:color="000000" w:sz="4" w:space="0"/>
+          <w:left w:val="none" w:color="000000" w:sz="4" w:space="0"/>
           <w:bottom w:val="single" w:color="000000" w:themeColor="accent4" w:themeTint="9A" w:sz="4" w:space="0"/>
-          <w:right w:val="none"/>
+          <w:right w:val="none" w:color="000000" w:sz="4" w:space="0"/>
         </w:tcBorders>
       </w:tcPr>
     </w:tblStylePr>
@@ -24262,12 +24467,12 @@
         <w:tblBorders/>
       </w:tblPr>
       <w:tcPr>
-        <w:shd w:color="ffffff"/>
+        <w:shd w:val="clear" w:color="ffffff"/>
         <w:tcBorders>
-          <w:top w:val="none"/>
+          <w:top w:val="none" w:color="000000" w:sz="4" w:space="0"/>
           <w:left w:val="single" w:color="000000" w:themeColor="accent4" w:themeTint="9A" w:sz="4" w:space="0"/>
-          <w:bottom w:val="none"/>
-          <w:right w:val="none"/>
+          <w:bottom w:val="none" w:color="000000" w:sz="4" w:space="0"/>
+          <w:right w:val="none" w:color="000000" w:sz="4" w:space="0"/>
         </w:tcBorders>
       </w:tcPr>
     </w:tblStylePr>
@@ -24290,9 +24495,9 @@
         <w:shd w:val="clear" w:color="ffffff" w:themeColor="light1" w:fill="ffffff" w:themeFill="light1"/>
         <w:tcBorders>
           <w:top w:val="single" w:color="000000" w:themeColor="accent4" w:themeTint="9A" w:sz="4" w:space="0"/>
-          <w:left w:val="none"/>
-          <w:bottom w:val="none"/>
-          <w:right w:val="none"/>
+          <w:left w:val="none" w:color="000000" w:sz="4" w:space="0"/>
+          <w:bottom w:val="none" w:color="000000" w:sz="4" w:space="0"/>
+          <w:right w:val="none" w:color="000000" w:sz="4" w:space="0"/>
         </w:tcBorders>
       </w:tcPr>
     </w:tblStylePr>
@@ -24367,9 +24572,9 @@
       </w:tcPr>
     </w:tblStylePr>
   </w:style>
-  <w:style w:type="table" w:styleId="115">
+  <w:style w:type="table" w:styleId="804">
     <w:name w:val="List Table 7 Colorful - Accent 5"/>
-    <w:basedOn w:val="666"/>
+    <w:basedOn w:val="889"/>
     <w:uiPriority w:val="99"/>
     <w:pPr>
       <w:pBdr/>
@@ -24468,11 +24673,11 @@
         <w:tblBorders/>
       </w:tblPr>
       <w:tcPr>
-        <w:shd w:color="ffffff"/>
+        <w:shd w:val="clear" w:color="ffffff"/>
         <w:tcBorders>
-          <w:top w:val="none"/>
-          <w:left w:val="none"/>
-          <w:bottom w:val="none"/>
+          <w:top w:val="none" w:color="000000" w:sz="4" w:space="0"/>
+          <w:left w:val="none" w:color="000000" w:sz="4" w:space="0"/>
+          <w:bottom w:val="none" w:color="000000" w:sz="4" w:space="0"/>
           <w:right w:val="single" w:color="000000" w:themeColor="accent5" w:themeTint="9A" w:sz="4" w:space="0"/>
         </w:tcBorders>
       </w:tcPr>
@@ -24495,10 +24700,10 @@
       <w:tcPr>
         <w:shd w:val="clear" w:color="ffffff" w:themeColor="light1" w:fill="ffffff" w:themeFill="light1"/>
         <w:tcBorders>
-          <w:top w:val="none"/>
-          <w:left w:val="none"/>
+          <w:top w:val="none" w:color="000000" w:sz="4" w:space="0"/>
+          <w:left w:val="none" w:color="000000" w:sz="4" w:space="0"/>
           <w:bottom w:val="single" w:color="000000" w:themeColor="accent5" w:themeTint="9A" w:sz="4" w:space="0"/>
-          <w:right w:val="none"/>
+          <w:right w:val="none" w:color="000000" w:sz="4" w:space="0"/>
         </w:tcBorders>
       </w:tcPr>
     </w:tblStylePr>
@@ -24518,12 +24723,12 @@
         <w:tblBorders/>
       </w:tblPr>
       <w:tcPr>
-        <w:shd w:color="ffffff"/>
+        <w:shd w:val="clear" w:color="ffffff"/>
         <w:tcBorders>
-          <w:top w:val="none"/>
+          <w:top w:val="none" w:color="000000" w:sz="4" w:space="0"/>
           <w:left w:val="single" w:color="000000" w:themeColor="accent5" w:themeTint="9A" w:sz="4" w:space="0"/>
-          <w:bottom w:val="none"/>
-          <w:right w:val="none"/>
+          <w:bottom w:val="none" w:color="000000" w:sz="4" w:space="0"/>
+          <w:right w:val="none" w:color="000000" w:sz="4" w:space="0"/>
         </w:tcBorders>
       </w:tcPr>
     </w:tblStylePr>
@@ -24546,9 +24751,9 @@
         <w:shd w:val="clear" w:color="ffffff" w:themeColor="light1" w:fill="ffffff" w:themeFill="light1"/>
         <w:tcBorders>
           <w:top w:val="single" w:color="000000" w:themeColor="accent5" w:themeTint="9A" w:sz="4" w:space="0"/>
-          <w:left w:val="none"/>
-          <w:bottom w:val="none"/>
-          <w:right w:val="none"/>
+          <w:left w:val="none" w:color="000000" w:sz="4" w:space="0"/>
+          <w:bottom w:val="none" w:color="000000" w:sz="4" w:space="0"/>
+          <w:right w:val="none" w:color="000000" w:sz="4" w:space="0"/>
         </w:tcBorders>
       </w:tcPr>
     </w:tblStylePr>
@@ -24623,9 +24828,9 @@
       </w:tcPr>
     </w:tblStylePr>
   </w:style>
-  <w:style w:type="table" w:styleId="116">
+  <w:style w:type="table" w:styleId="805">
     <w:name w:val="List Table 7 Colorful - Accent 6"/>
-    <w:basedOn w:val="666"/>
+    <w:basedOn w:val="889"/>
     <w:uiPriority w:val="99"/>
     <w:pPr>
       <w:pBdr/>
@@ -24724,11 +24929,11 @@
         <w:tblBorders/>
       </w:tblPr>
       <w:tcPr>
-        <w:shd w:color="ffffff"/>
+        <w:shd w:val="clear" w:color="ffffff"/>
         <w:tcBorders>
-          <w:top w:val="none"/>
-          <w:left w:val="none"/>
-          <w:bottom w:val="none"/>
+          <w:top w:val="none" w:color="000000" w:sz="4" w:space="0"/>
+          <w:left w:val="none" w:color="000000" w:sz="4" w:space="0"/>
+          <w:bottom w:val="none" w:color="000000" w:sz="4" w:space="0"/>
           <w:right w:val="single" w:color="000000" w:themeColor="accent6" w:themeTint="98" w:sz="4" w:space="0"/>
         </w:tcBorders>
       </w:tcPr>
@@ -24751,10 +24956,10 @@
       <w:tcPr>
         <w:shd w:val="clear" w:color="ffffff" w:themeColor="light1" w:fill="ffffff" w:themeFill="light1"/>
         <w:tcBorders>
-          <w:top w:val="none"/>
-          <w:left w:val="none"/>
+          <w:top w:val="none" w:color="000000" w:sz="4" w:space="0"/>
+          <w:left w:val="none" w:color="000000" w:sz="4" w:space="0"/>
           <w:bottom w:val="single" w:color="000000" w:themeColor="accent6" w:themeTint="98" w:sz="4" w:space="0"/>
-          <w:right w:val="none"/>
+          <w:right w:val="none" w:color="000000" w:sz="4" w:space="0"/>
         </w:tcBorders>
       </w:tcPr>
     </w:tblStylePr>
@@ -24774,12 +24979,12 @@
         <w:tblBorders/>
       </w:tblPr>
       <w:tcPr>
-        <w:shd w:color="ffffff"/>
+        <w:shd w:val="clear" w:color="ffffff"/>
         <w:tcBorders>
-          <w:top w:val="none"/>
+          <w:top w:val="none" w:color="000000" w:sz="4" w:space="0"/>
           <w:left w:val="single" w:color="000000" w:themeColor="accent6" w:themeTint="98" w:sz="4" w:space="0"/>
-          <w:bottom w:val="none"/>
-          <w:right w:val="none"/>
+          <w:bottom w:val="none" w:color="000000" w:sz="4" w:space="0"/>
+          <w:right w:val="none" w:color="000000" w:sz="4" w:space="0"/>
         </w:tcBorders>
       </w:tcPr>
     </w:tblStylePr>
@@ -24802,9 +25007,9 @@
         <w:shd w:val="clear" w:color="ffffff" w:themeColor="light1" w:fill="ffffff" w:themeFill="light1"/>
         <w:tcBorders>
           <w:top w:val="single" w:color="000000" w:themeColor="accent6" w:themeTint="98" w:sz="4" w:space="0"/>
-          <w:left w:val="none"/>
-          <w:bottom w:val="none"/>
-          <w:right w:val="none"/>
+          <w:left w:val="none" w:color="000000" w:sz="4" w:space="0"/>
+          <w:bottom w:val="none" w:color="000000" w:sz="4" w:space="0"/>
+          <w:right w:val="none" w:color="000000" w:sz="4" w:space="0"/>
         </w:tcBorders>
       </w:tcPr>
     </w:tblStylePr>
@@ -24879,9 +25084,9 @@
       </w:tcPr>
     </w:tblStylePr>
   </w:style>
-  <w:style w:type="table" w:styleId="117">
+  <w:style w:type="table" w:styleId="806">
     <w:name w:val="Lined - Accent"/>
-    <w:basedOn w:val="666"/>
+    <w:basedOn w:val="889"/>
     <w:uiPriority w:val="99"/>
     <w:pPr>
       <w:pBdr/>
@@ -25116,9 +25321,9 @@
       </w:tcPr>
     </w:tblStylePr>
   </w:style>
-  <w:style w:type="table" w:styleId="118">
+  <w:style w:type="table" w:styleId="807">
     <w:name w:val="Lined - Accent 1"/>
-    <w:basedOn w:val="666"/>
+    <w:basedOn w:val="889"/>
     <w:uiPriority w:val="99"/>
     <w:pPr>
       <w:pBdr/>
@@ -25353,9 +25558,9 @@
       </w:tcPr>
     </w:tblStylePr>
   </w:style>
-  <w:style w:type="table" w:styleId="119">
+  <w:style w:type="table" w:styleId="808">
     <w:name w:val="Lined - Accent 2"/>
-    <w:basedOn w:val="666"/>
+    <w:basedOn w:val="889"/>
     <w:uiPriority w:val="99"/>
     <w:pPr>
       <w:pBdr/>
@@ -25590,9 +25795,9 @@
       </w:tcPr>
     </w:tblStylePr>
   </w:style>
-  <w:style w:type="table" w:styleId="120">
+  <w:style w:type="table" w:styleId="809">
     <w:name w:val="Lined - Accent 3"/>
-    <w:basedOn w:val="666"/>
+    <w:basedOn w:val="889"/>
     <w:uiPriority w:val="99"/>
     <w:pPr>
       <w:pBdr/>
@@ -25827,9 +26032,9 @@
       </w:tcPr>
     </w:tblStylePr>
   </w:style>
-  <w:style w:type="table" w:styleId="121">
+  <w:style w:type="table" w:styleId="810">
     <w:name w:val="Lined - Accent 4"/>
-    <w:basedOn w:val="666"/>
+    <w:basedOn w:val="889"/>
     <w:uiPriority w:val="99"/>
     <w:pPr>
       <w:pBdr/>
@@ -26064,9 +26269,9 @@
       </w:tcPr>
     </w:tblStylePr>
   </w:style>
-  <w:style w:type="table" w:styleId="122">
+  <w:style w:type="table" w:styleId="811">
     <w:name w:val="Lined - Accent 5"/>
-    <w:basedOn w:val="666"/>
+    <w:basedOn w:val="889"/>
     <w:uiPriority w:val="99"/>
     <w:pPr>
       <w:pBdr/>
@@ -26301,9 +26506,9 @@
       </w:tcPr>
     </w:tblStylePr>
   </w:style>
-  <w:style w:type="table" w:styleId="123">
+  <w:style w:type="table" w:styleId="812">
     <w:name w:val="Lined - Accent 6"/>
-    <w:basedOn w:val="666"/>
+    <w:basedOn w:val="889"/>
     <w:uiPriority w:val="99"/>
     <w:pPr>
       <w:pBdr/>
@@ -26538,9 +26743,9 @@
       </w:tcPr>
     </w:tblStylePr>
   </w:style>
-  <w:style w:type="table" w:styleId="124">
+  <w:style w:type="table" w:styleId="813">
     <w:name w:val="Bordered &amp; Lined - Accent"/>
-    <w:basedOn w:val="666"/>
+    <w:basedOn w:val="889"/>
     <w:uiPriority w:val="99"/>
     <w:pPr>
       <w:pBdr/>
@@ -26782,9 +26987,9 @@
       </w:tcPr>
     </w:tblStylePr>
   </w:style>
-  <w:style w:type="table" w:styleId="125">
+  <w:style w:type="table" w:styleId="814">
     <w:name w:val="Bordered &amp; Lined - Accent 1"/>
-    <w:basedOn w:val="666"/>
+    <w:basedOn w:val="889"/>
     <w:uiPriority w:val="99"/>
     <w:pPr>
       <w:pBdr/>
@@ -27026,9 +27231,9 @@
       </w:tcPr>
     </w:tblStylePr>
   </w:style>
-  <w:style w:type="table" w:styleId="126">
+  <w:style w:type="table" w:styleId="815">
     <w:name w:val="Bordered &amp; Lined - Accent 2"/>
-    <w:basedOn w:val="666"/>
+    <w:basedOn w:val="889"/>
     <w:uiPriority w:val="99"/>
     <w:pPr>
       <w:pBdr/>
@@ -27270,9 +27475,9 @@
       </w:tcPr>
     </w:tblStylePr>
   </w:style>
-  <w:style w:type="table" w:styleId="127">
+  <w:style w:type="table" w:styleId="816">
     <w:name w:val="Bordered &amp; Lined - Accent 3"/>
-    <w:basedOn w:val="666"/>
+    <w:basedOn w:val="889"/>
     <w:uiPriority w:val="99"/>
     <w:pPr>
       <w:pBdr/>
@@ -27514,9 +27719,9 @@
       </w:tcPr>
     </w:tblStylePr>
   </w:style>
-  <w:style w:type="table" w:styleId="128">
+  <w:style w:type="table" w:styleId="817">
     <w:name w:val="Bordered &amp; Lined - Accent 4"/>
-    <w:basedOn w:val="666"/>
+    <w:basedOn w:val="889"/>
     <w:uiPriority w:val="99"/>
     <w:pPr>
       <w:pBdr/>
@@ -27758,9 +27963,9 @@
       </w:tcPr>
     </w:tblStylePr>
   </w:style>
-  <w:style w:type="table" w:styleId="129">
+  <w:style w:type="table" w:styleId="818">
     <w:name w:val="Bordered &amp; Lined - Accent 5"/>
-    <w:basedOn w:val="666"/>
+    <w:basedOn w:val="889"/>
     <w:uiPriority w:val="99"/>
     <w:pPr>
       <w:pBdr/>
@@ -28002,9 +28207,9 @@
       </w:tcPr>
     </w:tblStylePr>
   </w:style>
-  <w:style w:type="table" w:styleId="130">
+  <w:style w:type="table" w:styleId="819">
     <w:name w:val="Bordered &amp; Lined - Accent 6"/>
-    <w:basedOn w:val="666"/>
+    <w:basedOn w:val="889"/>
     <w:uiPriority w:val="99"/>
     <w:pPr>
       <w:pBdr/>
@@ -28246,9 +28451,9 @@
       </w:tcPr>
     </w:tblStylePr>
   </w:style>
-  <w:style w:type="table" w:styleId="131">
+  <w:style w:type="table" w:styleId="820">
     <w:name w:val="Bordered"/>
-    <w:basedOn w:val="666"/>
+    <w:basedOn w:val="889"/>
     <w:uiPriority w:val="99"/>
     <w:pPr>
       <w:pBdr/>
@@ -28477,9 +28682,9 @@
       </w:tcPr>
     </w:tblStylePr>
   </w:style>
-  <w:style w:type="table" w:styleId="132">
+  <w:style w:type="table" w:styleId="821">
     <w:name w:val="Bordered - Accent 1"/>
-    <w:basedOn w:val="666"/>
+    <w:basedOn w:val="889"/>
     <w:uiPriority w:val="99"/>
     <w:pPr>
       <w:pBdr/>
@@ -28708,9 +28913,9 @@
       </w:tcPr>
     </w:tblStylePr>
   </w:style>
-  <w:style w:type="table" w:styleId="133">
+  <w:style w:type="table" w:styleId="822">
     <w:name w:val="Bordered - Accent 2"/>
-    <w:basedOn w:val="666"/>
+    <w:basedOn w:val="889"/>
     <w:uiPriority w:val="99"/>
     <w:pPr>
       <w:pBdr/>
@@ -28939,9 +29144,9 @@
       </w:tcPr>
     </w:tblStylePr>
   </w:style>
-  <w:style w:type="table" w:styleId="134">
+  <w:style w:type="table" w:styleId="823">
     <w:name w:val="Bordered - Accent 3"/>
-    <w:basedOn w:val="666"/>
+    <w:basedOn w:val="889"/>
     <w:uiPriority w:val="99"/>
     <w:pPr>
       <w:pBdr/>
@@ -29170,9 +29375,9 @@
       </w:tcPr>
     </w:tblStylePr>
   </w:style>
-  <w:style w:type="table" w:styleId="135">
+  <w:style w:type="table" w:styleId="824">
     <w:name w:val="Bordered - Accent 4"/>
-    <w:basedOn w:val="666"/>
+    <w:basedOn w:val="889"/>
     <w:uiPriority w:val="99"/>
     <w:pPr>
       <w:pBdr/>
@@ -29401,9 +29606,9 @@
       </w:tcPr>
     </w:tblStylePr>
   </w:style>
-  <w:style w:type="table" w:styleId="136">
+  <w:style w:type="table" w:styleId="825">
     <w:name w:val="Bordered - Accent 5"/>
-    <w:basedOn w:val="666"/>
+    <w:basedOn w:val="889"/>
     <w:uiPriority w:val="99"/>
     <w:pPr>
       <w:pBdr/>
@@ -29632,9 +29837,9 @@
       </w:tcPr>
     </w:tblStylePr>
   </w:style>
-  <w:style w:type="table" w:styleId="137">
+  <w:style w:type="table" w:styleId="826">
     <w:name w:val="Bordered - Accent 6"/>
-    <w:basedOn w:val="666"/>
+    <w:basedOn w:val="889"/>
     <w:uiPriority w:val="99"/>
     <w:pPr>
       <w:pBdr/>
@@ -29863,11 +30068,11 @@
       </w:tcPr>
     </w:tblStylePr>
   </w:style>
-  <w:style w:type="paragraph" w:styleId="139">
+  <w:style w:type="paragraph" w:styleId="827">
     <w:name w:val="Heading 1"/>
-    <w:basedOn w:val="664"/>
-    <w:next w:val="664"/>
-    <w:link w:val="150"/>
+    <w:basedOn w:val="887"/>
+    <w:next w:val="887"/>
+    <w:link w:val="836"/>
     <w:uiPriority w:val="9"/>
     <w:qFormat/>
     <w:pPr>
@@ -29885,11 +30090,11 @@
       <w:szCs w:val="40"/>
     </w:rPr>
   </w:style>
-  <w:style w:type="paragraph" w:styleId="140">
+  <w:style w:type="paragraph" w:styleId="828">
     <w:name w:val="Heading 2"/>
-    <w:basedOn w:val="664"/>
-    <w:next w:val="664"/>
-    <w:link w:val="151"/>
+    <w:basedOn w:val="887"/>
+    <w:next w:val="887"/>
+    <w:link w:val="837"/>
     <w:uiPriority w:val="9"/>
     <w:unhideWhenUsed/>
     <w:qFormat/>
@@ -29908,11 +30113,11 @@
       <w:szCs w:val="32"/>
     </w:rPr>
   </w:style>
-  <w:style w:type="paragraph" w:styleId="141">
+  <w:style w:type="paragraph" w:styleId="829">
     <w:name w:val="Heading 3"/>
-    <w:basedOn w:val="664"/>
-    <w:next w:val="664"/>
-    <w:link w:val="152"/>
+    <w:basedOn w:val="887"/>
+    <w:next w:val="887"/>
+    <w:link w:val="838"/>
     <w:uiPriority w:val="9"/>
     <w:unhideWhenUsed/>
     <w:qFormat/>
@@ -29931,11 +30136,11 @@
       <w:szCs w:val="28"/>
     </w:rPr>
   </w:style>
-  <w:style w:type="paragraph" w:styleId="142">
+  <w:style w:type="paragraph" w:styleId="830">
     <w:name w:val="Heading 4"/>
-    <w:basedOn w:val="664"/>
-    <w:next w:val="664"/>
-    <w:link w:val="153"/>
+    <w:basedOn w:val="887"/>
+    <w:next w:val="887"/>
+    <w:link w:val="839"/>
     <w:uiPriority w:val="9"/>
     <w:unhideWhenUsed/>
     <w:qFormat/>
@@ -29954,11 +30159,11 @@
       <w:color w:val="0f4761" w:themeColor="accent1" w:themeShade="BF"/>
     </w:rPr>
   </w:style>
-  <w:style w:type="paragraph" w:styleId="143">
+  <w:style w:type="paragraph" w:styleId="831">
     <w:name w:val="Heading 5"/>
-    <w:basedOn w:val="664"/>
-    <w:next w:val="664"/>
-    <w:link w:val="154"/>
+    <w:basedOn w:val="887"/>
+    <w:next w:val="887"/>
+    <w:link w:val="840"/>
     <w:uiPriority w:val="9"/>
     <w:unhideWhenUsed/>
     <w:qFormat/>
@@ -29975,11 +30180,11 @@
       <w:color w:val="0f4761" w:themeColor="accent1" w:themeShade="BF"/>
     </w:rPr>
   </w:style>
-  <w:style w:type="paragraph" w:styleId="144">
+  <w:style w:type="paragraph" w:styleId="832">
     <w:name w:val="Heading 6"/>
-    <w:basedOn w:val="664"/>
-    <w:next w:val="664"/>
-    <w:link w:val="155"/>
+    <w:basedOn w:val="887"/>
+    <w:next w:val="887"/>
+    <w:link w:val="841"/>
     <w:uiPriority w:val="9"/>
     <w:unhideWhenUsed/>
     <w:qFormat/>
@@ -29998,11 +30203,11 @@
       <w:color w:val="595959" w:themeColor="text1" w:themeTint="A6"/>
     </w:rPr>
   </w:style>
-  <w:style w:type="paragraph" w:styleId="145">
+  <w:style w:type="paragraph" w:styleId="833">
     <w:name w:val="Heading 7"/>
-    <w:basedOn w:val="664"/>
-    <w:next w:val="664"/>
-    <w:link w:val="156"/>
+    <w:basedOn w:val="887"/>
+    <w:next w:val="887"/>
+    <w:link w:val="842"/>
     <w:uiPriority w:val="9"/>
     <w:unhideWhenUsed/>
     <w:qFormat/>
@@ -30019,11 +30224,11 @@
       <w:color w:val="595959" w:themeColor="text1" w:themeTint="A6"/>
     </w:rPr>
   </w:style>
-  <w:style w:type="paragraph" w:styleId="146">
+  <w:style w:type="paragraph" w:styleId="834">
     <w:name w:val="Heading 8"/>
-    <w:basedOn w:val="664"/>
-    <w:next w:val="664"/>
-    <w:link w:val="157"/>
+    <w:basedOn w:val="887"/>
+    <w:next w:val="887"/>
+    <w:link w:val="843"/>
     <w:uiPriority w:val="9"/>
     <w:unhideWhenUsed/>
     <w:qFormat/>
@@ -30042,11 +30247,11 @@
       <w:color w:val="272727" w:themeColor="text1" w:themeTint="D8"/>
     </w:rPr>
   </w:style>
-  <w:style w:type="paragraph" w:styleId="147">
+  <w:style w:type="paragraph" w:styleId="835">
     <w:name w:val="Heading 9"/>
-    <w:basedOn w:val="664"/>
-    <w:next w:val="664"/>
-    <w:link w:val="158"/>
+    <w:basedOn w:val="887"/>
+    <w:next w:val="887"/>
+    <w:link w:val="844"/>
     <w:uiPriority w:val="9"/>
     <w:unhideWhenUsed/>
     <w:qFormat/>
@@ -30065,10 +30270,10 @@
       <w:color w:val="272727" w:themeColor="text1" w:themeTint="D8"/>
     </w:rPr>
   </w:style>
-  <w:style w:type="character" w:styleId="150">
+  <w:style w:type="character" w:styleId="836">
     <w:name w:val="Heading 1 Char"/>
-    <w:basedOn w:val="665"/>
-    <w:link w:val="139"/>
+    <w:basedOn w:val="888"/>
+    <w:link w:val="827"/>
     <w:uiPriority w:val="9"/>
     <w:pPr>
       <w:pBdr/>
@@ -30082,10 +30287,10 @@
       <w:szCs w:val="40"/>
     </w:rPr>
   </w:style>
-  <w:style w:type="character" w:styleId="151">
+  <w:style w:type="character" w:styleId="837">
     <w:name w:val="Heading 2 Char"/>
-    <w:basedOn w:val="665"/>
-    <w:link w:val="140"/>
+    <w:basedOn w:val="888"/>
+    <w:link w:val="828"/>
     <w:uiPriority w:val="9"/>
     <w:pPr>
       <w:pBdr/>
@@ -30099,10 +30304,10 @@
       <w:szCs w:val="32"/>
     </w:rPr>
   </w:style>
-  <w:style w:type="character" w:styleId="152">
+  <w:style w:type="character" w:styleId="838">
     <w:name w:val="Heading 3 Char"/>
-    <w:basedOn w:val="665"/>
-    <w:link w:val="141"/>
+    <w:basedOn w:val="888"/>
+    <w:link w:val="829"/>
     <w:uiPriority w:val="9"/>
     <w:pPr>
       <w:pBdr/>
@@ -30116,10 +30321,10 @@
       <w:szCs w:val="28"/>
     </w:rPr>
   </w:style>
-  <w:style w:type="character" w:styleId="153">
+  <w:style w:type="character" w:styleId="839">
     <w:name w:val="Heading 4 Char"/>
-    <w:basedOn w:val="665"/>
-    <w:link w:val="142"/>
+    <w:basedOn w:val="888"/>
+    <w:link w:val="830"/>
     <w:uiPriority w:val="9"/>
     <w:pPr>
       <w:pBdr/>
@@ -30133,10 +30338,10 @@
       <w:color w:val="0f4761" w:themeColor="accent1" w:themeShade="BF"/>
     </w:rPr>
   </w:style>
-  <w:style w:type="character" w:styleId="154">
+  <w:style w:type="character" w:styleId="840">
     <w:name w:val="Heading 5 Char"/>
-    <w:basedOn w:val="665"/>
-    <w:link w:val="143"/>
+    <w:basedOn w:val="888"/>
+    <w:link w:val="831"/>
     <w:uiPriority w:val="9"/>
     <w:pPr>
       <w:pBdr/>
@@ -30148,10 +30353,10 @@
       <w:color w:val="0f4761" w:themeColor="accent1" w:themeShade="BF"/>
     </w:rPr>
   </w:style>
-  <w:style w:type="character" w:styleId="155">
+  <w:style w:type="character" w:styleId="841">
     <w:name w:val="Heading 6 Char"/>
-    <w:basedOn w:val="665"/>
-    <w:link w:val="144"/>
+    <w:basedOn w:val="888"/>
+    <w:link w:val="832"/>
     <w:uiPriority w:val="9"/>
     <w:pPr>
       <w:pBdr/>
@@ -30165,10 +30370,10 @@
       <w:color w:val="595959" w:themeColor="text1" w:themeTint="A6"/>
     </w:rPr>
   </w:style>
-  <w:style w:type="character" w:styleId="156">
+  <w:style w:type="character" w:styleId="842">
     <w:name w:val="Heading 7 Char"/>
-    <w:basedOn w:val="665"/>
-    <w:link w:val="145"/>
+    <w:basedOn w:val="888"/>
+    <w:link w:val="833"/>
     <w:uiPriority w:val="9"/>
     <w:pPr>
       <w:pBdr/>
@@ -30180,10 +30385,10 @@
       <w:color w:val="595959" w:themeColor="text1" w:themeTint="A6"/>
     </w:rPr>
   </w:style>
-  <w:style w:type="character" w:styleId="157">
+  <w:style w:type="character" w:styleId="843">
     <w:name w:val="Heading 8 Char"/>
-    <w:basedOn w:val="665"/>
-    <w:link w:val="146"/>
+    <w:basedOn w:val="888"/>
+    <w:link w:val="834"/>
     <w:uiPriority w:val="9"/>
     <w:pPr>
       <w:pBdr/>
@@ -30197,10 +30402,10 @@
       <w:color w:val="272727" w:themeColor="text1" w:themeTint="D8"/>
     </w:rPr>
   </w:style>
-  <w:style w:type="character" w:styleId="158">
+  <w:style w:type="character" w:styleId="844">
     <w:name w:val="Heading 9 Char"/>
-    <w:basedOn w:val="665"/>
-    <w:link w:val="147"/>
+    <w:basedOn w:val="888"/>
+    <w:link w:val="835"/>
     <w:uiPriority w:val="9"/>
     <w:pPr>
       <w:pBdr/>
@@ -30214,11 +30419,11 @@
       <w:color w:val="272727" w:themeColor="text1" w:themeTint="D8"/>
     </w:rPr>
   </w:style>
-  <w:style w:type="paragraph" w:styleId="159">
+  <w:style w:type="paragraph" w:styleId="845">
     <w:name w:val="Title"/>
-    <w:basedOn w:val="664"/>
-    <w:next w:val="664"/>
-    <w:link w:val="160"/>
+    <w:basedOn w:val="887"/>
+    <w:next w:val="887"/>
+    <w:link w:val="846"/>
     <w:uiPriority w:val="10"/>
     <w:qFormat/>
     <w:pPr>
@@ -30234,10 +30439,10 @@
       <w:szCs w:val="56"/>
     </w:rPr>
   </w:style>
-  <w:style w:type="character" w:styleId="160">
+  <w:style w:type="character" w:styleId="846">
     <w:name w:val="Title Char"/>
-    <w:basedOn w:val="665"/>
-    <w:link w:val="159"/>
+    <w:basedOn w:val="888"/>
+    <w:link w:val="845"/>
     <w:uiPriority w:val="10"/>
     <w:pPr>
       <w:pBdr/>
@@ -30251,11 +30456,11 @@
       <w:szCs w:val="56"/>
     </w:rPr>
   </w:style>
-  <w:style w:type="paragraph" w:styleId="161">
+  <w:style w:type="paragraph" w:styleId="847">
     <w:name w:val="Subtitle"/>
-    <w:basedOn w:val="664"/>
-    <w:next w:val="664"/>
-    <w:link w:val="162"/>
+    <w:basedOn w:val="887"/>
+    <w:next w:val="887"/>
+    <w:link w:val="848"/>
     <w:uiPriority w:val="11"/>
     <w:qFormat/>
     <w:pPr>
@@ -30273,10 +30478,10 @@
       <w:szCs w:val="28"/>
     </w:rPr>
   </w:style>
-  <w:style w:type="character" w:styleId="162">
+  <w:style w:type="character" w:styleId="848">
     <w:name w:val="Subtitle Char"/>
-    <w:basedOn w:val="665"/>
-    <w:link w:val="161"/>
+    <w:basedOn w:val="888"/>
+    <w:link w:val="847"/>
     <w:uiPriority w:val="11"/>
     <w:pPr>
       <w:pBdr/>
@@ -30290,11 +30495,11 @@
       <w:szCs w:val="28"/>
     </w:rPr>
   </w:style>
-  <w:style w:type="paragraph" w:styleId="163">
+  <w:style w:type="paragraph" w:styleId="849">
     <w:name w:val="Quote"/>
-    <w:basedOn w:val="664"/>
-    <w:next w:val="664"/>
-    <w:link w:val="164"/>
+    <w:basedOn w:val="887"/>
+    <w:next w:val="887"/>
+    <w:link w:val="850"/>
     <w:uiPriority w:val="29"/>
     <w:qFormat/>
     <w:pPr>
@@ -30309,10 +30514,10 @@
       <w:color w:val="404040" w:themeColor="text1" w:themeTint="BF"/>
     </w:rPr>
   </w:style>
-  <w:style w:type="character" w:styleId="164">
+  <w:style w:type="character" w:styleId="850">
     <w:name w:val="Quote Char"/>
-    <w:basedOn w:val="665"/>
-    <w:link w:val="163"/>
+    <w:basedOn w:val="888"/>
+    <w:link w:val="849"/>
     <w:uiPriority w:val="29"/>
     <w:pPr>
       <w:pBdr/>
@@ -30325,9 +30530,9 @@
       <w:color w:val="404040" w:themeColor="text1" w:themeTint="BF"/>
     </w:rPr>
   </w:style>
-  <w:style w:type="paragraph" w:styleId="165">
+  <w:style w:type="paragraph" w:styleId="851">
     <w:name w:val="List Paragraph"/>
-    <w:basedOn w:val="664"/>
+    <w:basedOn w:val="887"/>
     <w:uiPriority w:val="34"/>
     <w:qFormat/>
     <w:pPr>
@@ -30337,9 +30542,9 @@
       <w:contextualSpacing w:val="true"/>
     </w:pPr>
   </w:style>
-  <w:style w:type="character" w:styleId="166">
+  <w:style w:type="character" w:styleId="852">
     <w:name w:val="Intense Emphasis"/>
-    <w:basedOn w:val="665"/>
+    <w:basedOn w:val="888"/>
     <w:uiPriority w:val="21"/>
     <w:qFormat/>
     <w:pPr>
@@ -30353,11 +30558,11 @@
       <w:color w:val="0f4761" w:themeColor="accent1" w:themeShade="BF"/>
     </w:rPr>
   </w:style>
-  <w:style w:type="paragraph" w:styleId="167">
+  <w:style w:type="paragraph" w:styleId="853">
     <w:name w:val="Intense Quote"/>
-    <w:basedOn w:val="664"/>
-    <w:next w:val="664"/>
-    <w:link w:val="168"/>
+    <w:basedOn w:val="887"/>
+    <w:next w:val="887"/>
+    <w:link w:val="854"/>
     <w:uiPriority w:val="30"/>
     <w:qFormat/>
     <w:pPr>
@@ -30375,10 +30580,10 @@
       <w:color w:val="0f4761" w:themeColor="accent1" w:themeShade="BF"/>
     </w:rPr>
   </w:style>
-  <w:style w:type="character" w:styleId="168">
+  <w:style w:type="character" w:styleId="854">
     <w:name w:val="Intense Quote Char"/>
-    <w:basedOn w:val="665"/>
-    <w:link w:val="167"/>
+    <w:basedOn w:val="888"/>
+    <w:link w:val="853"/>
     <w:uiPriority w:val="30"/>
     <w:pPr>
       <w:pBdr/>
@@ -30391,9 +30596,9 @@
       <w:color w:val="0f4761" w:themeColor="accent1" w:themeShade="BF"/>
     </w:rPr>
   </w:style>
-  <w:style w:type="character" w:styleId="169">
+  <w:style w:type="character" w:styleId="855">
     <w:name w:val="Intense Reference"/>
-    <w:basedOn w:val="665"/>
+    <w:basedOn w:val="888"/>
     <w:uiPriority w:val="32"/>
     <w:qFormat/>
     <w:pPr>
@@ -30409,9 +30614,9 @@
       <w:spacing w:val="5"/>
     </w:rPr>
   </w:style>
-  <w:style w:type="paragraph" w:styleId="170">
+  <w:style w:type="paragraph" w:styleId="856">
     <w:name w:val="No Spacing"/>
-    <w:basedOn w:val="664"/>
+    <w:basedOn w:val="887"/>
     <w:uiPriority w:val="1"/>
     <w:qFormat/>
     <w:pPr>
@@ -30420,9 +30625,9 @@
       <w:ind/>
     </w:pPr>
   </w:style>
-  <w:style w:type="character" w:styleId="171">
+  <w:style w:type="character" w:styleId="857">
     <w:name w:val="Subtle Emphasis"/>
-    <w:basedOn w:val="665"/>
+    <w:basedOn w:val="888"/>
     <w:uiPriority w:val="19"/>
     <w:qFormat/>
     <w:pPr>
@@ -30436,9 +30641,9 @@
       <w:color w:val="404040" w:themeColor="text1" w:themeTint="BF"/>
     </w:rPr>
   </w:style>
-  <w:style w:type="character" w:styleId="172">
+  <w:style w:type="character" w:styleId="858">
     <w:name w:val="Emphasis"/>
-    <w:basedOn w:val="665"/>
+    <w:basedOn w:val="888"/>
     <w:uiPriority w:val="20"/>
     <w:qFormat/>
     <w:pPr>
@@ -30451,9 +30656,9 @@
       <w:iCs/>
     </w:rPr>
   </w:style>
-  <w:style w:type="character" w:styleId="173">
+  <w:style w:type="character" w:styleId="859">
     <w:name w:val="Strong"/>
-    <w:basedOn w:val="665"/>
+    <w:basedOn w:val="888"/>
     <w:uiPriority w:val="22"/>
     <w:qFormat/>
     <w:pPr>
@@ -30466,9 +30671,9 @@
       <w:bCs/>
     </w:rPr>
   </w:style>
-  <w:style w:type="character" w:styleId="174">
+  <w:style w:type="character" w:styleId="860">
     <w:name w:val="Subtle Reference"/>
-    <w:basedOn w:val="665"/>
+    <w:basedOn w:val="888"/>
     <w:uiPriority w:val="31"/>
     <w:qFormat/>
     <w:pPr>
@@ -30481,9 +30686,9 @@
       <w:color w:val="5a5a5a" w:themeColor="text1" w:themeTint="A5"/>
     </w:rPr>
   </w:style>
-  <w:style w:type="character" w:styleId="175">
+  <w:style w:type="character" w:styleId="861">
     <w:name w:val="Book Title"/>
-    <w:basedOn w:val="665"/>
+    <w:basedOn w:val="888"/>
     <w:uiPriority w:val="33"/>
     <w:qFormat/>
     <w:pPr>
@@ -30499,10 +30704,10 @@
       <w:spacing w:val="5"/>
     </w:rPr>
   </w:style>
-  <w:style w:type="paragraph" w:styleId="176">
+  <w:style w:type="paragraph" w:styleId="862">
     <w:name w:val="Header"/>
-    <w:basedOn w:val="664"/>
-    <w:link w:val="177"/>
+    <w:basedOn w:val="887"/>
+    <w:link w:val="863"/>
     <w:uiPriority w:val="99"/>
     <w:unhideWhenUsed/>
     <w:pPr>
@@ -30515,10 +30720,10 @@
       <w:ind/>
     </w:pPr>
   </w:style>
-  <w:style w:type="character" w:styleId="177">
+  <w:style w:type="character" w:styleId="863">
     <w:name w:val="Header Char"/>
-    <w:basedOn w:val="665"/>
-    <w:link w:val="176"/>
+    <w:basedOn w:val="888"/>
+    <w:link w:val="862"/>
     <w:uiPriority w:val="99"/>
     <w:pPr>
       <w:pBdr/>
@@ -30526,10 +30731,10 @@
       <w:ind/>
     </w:pPr>
   </w:style>
-  <w:style w:type="paragraph" w:styleId="178">
+  <w:style w:type="paragraph" w:styleId="864">
     <w:name w:val="Footer"/>
-    <w:basedOn w:val="664"/>
-    <w:link w:val="179"/>
+    <w:basedOn w:val="887"/>
+    <w:link w:val="865"/>
     <w:uiPriority w:val="99"/>
     <w:unhideWhenUsed/>
     <w:pPr>
@@ -30542,10 +30747,10 @@
       <w:ind/>
     </w:pPr>
   </w:style>
-  <w:style w:type="character" w:styleId="179">
+  <w:style w:type="character" w:styleId="865">
     <w:name w:val="Footer Char"/>
-    <w:basedOn w:val="665"/>
-    <w:link w:val="178"/>
+    <w:basedOn w:val="888"/>
+    <w:link w:val="864"/>
     <w:uiPriority w:val="99"/>
     <w:pPr>
       <w:pBdr/>
@@ -30553,10 +30758,10 @@
       <w:ind/>
     </w:pPr>
   </w:style>
-  <w:style w:type="paragraph" w:styleId="180">
+  <w:style w:type="paragraph" w:styleId="866">
     <w:name w:val="Caption"/>
-    <w:basedOn w:val="664"/>
-    <w:next w:val="664"/>
+    <w:basedOn w:val="887"/>
+    <w:next w:val="887"/>
     <w:uiPriority w:val="35"/>
     <w:unhideWhenUsed/>
     <w:qFormat/>
@@ -30573,10 +30778,10 @@
       <w:szCs w:val="18"/>
     </w:rPr>
   </w:style>
-  <w:style w:type="paragraph" w:styleId="181">
+  <w:style w:type="paragraph" w:styleId="867">
     <w:name w:val="footnote text"/>
-    <w:basedOn w:val="664"/>
-    <w:link w:val="182"/>
+    <w:basedOn w:val="887"/>
+    <w:link w:val="868"/>
     <w:uiPriority w:val="99"/>
     <w:semiHidden/>
     <w:unhideWhenUsed/>
@@ -30590,10 +30795,10 @@
       <w:szCs w:val="20"/>
     </w:rPr>
   </w:style>
-  <w:style w:type="character" w:styleId="182">
+  <w:style w:type="character" w:styleId="868">
     <w:name w:val="Footnote Text Char"/>
-    <w:basedOn w:val="665"/>
-    <w:link w:val="181"/>
+    <w:basedOn w:val="888"/>
+    <w:link w:val="867"/>
     <w:uiPriority w:val="99"/>
     <w:semiHidden/>
     <w:pPr>
@@ -30606,9 +30811,9 @@
       <w:szCs w:val="20"/>
     </w:rPr>
   </w:style>
-  <w:style w:type="character" w:styleId="183">
+  <w:style w:type="character" w:styleId="869">
     <w:name w:val="footnote reference"/>
-    <w:basedOn w:val="665"/>
+    <w:basedOn w:val="888"/>
     <w:uiPriority w:val="99"/>
     <w:semiHidden/>
     <w:unhideWhenUsed/>
@@ -30621,10 +30826,10 @@
       <w:vertAlign w:val="superscript"/>
     </w:rPr>
   </w:style>
-  <w:style w:type="paragraph" w:styleId="184">
+  <w:style w:type="paragraph" w:styleId="870">
     <w:name w:val="endnote text"/>
-    <w:basedOn w:val="664"/>
-    <w:link w:val="185"/>
+    <w:basedOn w:val="887"/>
+    <w:link w:val="871"/>
     <w:uiPriority w:val="99"/>
     <w:semiHidden/>
     <w:unhideWhenUsed/>
@@ -30638,10 +30843,10 @@
       <w:szCs w:val="20"/>
     </w:rPr>
   </w:style>
-  <w:style w:type="character" w:styleId="185">
+  <w:style w:type="character" w:styleId="871">
     <w:name w:val="Endnote Text Char"/>
-    <w:basedOn w:val="665"/>
-    <w:link w:val="184"/>
+    <w:basedOn w:val="888"/>
+    <w:link w:val="870"/>
     <w:uiPriority w:val="99"/>
     <w:semiHidden/>
     <w:pPr>
@@ -30654,9 +30859,9 @@
       <w:szCs w:val="20"/>
     </w:rPr>
   </w:style>
-  <w:style w:type="character" w:styleId="186">
+  <w:style w:type="character" w:styleId="872">
     <w:name w:val="endnote reference"/>
-    <w:basedOn w:val="665"/>
+    <w:basedOn w:val="888"/>
     <w:uiPriority w:val="99"/>
     <w:semiHidden/>
     <w:unhideWhenUsed/>
@@ -30669,9 +30874,9 @@
       <w:vertAlign w:val="superscript"/>
     </w:rPr>
   </w:style>
-  <w:style w:type="character" w:styleId="187">
+  <w:style w:type="character" w:styleId="873">
     <w:name w:val="Hyperlink"/>
-    <w:basedOn w:val="665"/>
+    <w:basedOn w:val="888"/>
     <w:uiPriority w:val="99"/>
     <w:unhideWhenUsed/>
     <w:pPr>
@@ -30684,9 +30889,9 @@
       <w:u w:val="single"/>
     </w:rPr>
   </w:style>
-  <w:style w:type="character" w:styleId="188">
+  <w:style w:type="character" w:styleId="874">
     <w:name w:val="FollowedHyperlink"/>
-    <w:basedOn w:val="665"/>
+    <w:basedOn w:val="888"/>
     <w:uiPriority w:val="99"/>
     <w:semiHidden/>
     <w:unhideWhenUsed/>
@@ -30700,10 +30905,10 @@
       <w:u w:val="single"/>
     </w:rPr>
   </w:style>
-  <w:style w:type="paragraph" w:styleId="189">
+  <w:style w:type="paragraph" w:styleId="875">
     <w:name w:val="toc 1"/>
-    <w:basedOn w:val="664"/>
-    <w:next w:val="664"/>
+    <w:basedOn w:val="887"/>
+    <w:next w:val="887"/>
     <w:uiPriority w:val="39"/>
     <w:unhideWhenUsed/>
     <w:pPr>
@@ -30712,10 +30917,10 @@
       <w:ind/>
     </w:pPr>
   </w:style>
-  <w:style w:type="paragraph" w:styleId="190">
+  <w:style w:type="paragraph" w:styleId="876">
     <w:name w:val="toc 2"/>
-    <w:basedOn w:val="664"/>
-    <w:next w:val="664"/>
+    <w:basedOn w:val="887"/>
+    <w:next w:val="887"/>
     <w:uiPriority w:val="39"/>
     <w:unhideWhenUsed/>
     <w:pPr>
@@ -30724,10 +30929,10 @@
       <w:ind w:left="220"/>
     </w:pPr>
   </w:style>
-  <w:style w:type="paragraph" w:styleId="191">
+  <w:style w:type="paragraph" w:styleId="877">
     <w:name w:val="toc 3"/>
-    <w:basedOn w:val="664"/>
-    <w:next w:val="664"/>
+    <w:basedOn w:val="887"/>
+    <w:next w:val="887"/>
     <w:uiPriority w:val="39"/>
     <w:unhideWhenUsed/>
     <w:pPr>
@@ -30736,10 +30941,10 @@
       <w:ind w:left="440"/>
     </w:pPr>
   </w:style>
-  <w:style w:type="paragraph" w:styleId="192">
+  <w:style w:type="paragraph" w:styleId="878">
     <w:name w:val="toc 4"/>
-    <w:basedOn w:val="664"/>
-    <w:next w:val="664"/>
+    <w:basedOn w:val="887"/>
+    <w:next w:val="887"/>
     <w:uiPriority w:val="39"/>
     <w:unhideWhenUsed/>
     <w:pPr>
@@ -30748,10 +30953,10 @@
       <w:ind w:left="660"/>
     </w:pPr>
   </w:style>
-  <w:style w:type="paragraph" w:styleId="193">
+  <w:style w:type="paragraph" w:styleId="879">
     <w:name w:val="toc 5"/>
-    <w:basedOn w:val="664"/>
-    <w:next w:val="664"/>
+    <w:basedOn w:val="887"/>
+    <w:next w:val="887"/>
     <w:uiPriority w:val="39"/>
     <w:unhideWhenUsed/>
     <w:pPr>
@@ -30760,10 +30965,10 @@
       <w:ind w:left="880"/>
     </w:pPr>
   </w:style>
-  <w:style w:type="paragraph" w:styleId="194">
+  <w:style w:type="paragraph" w:styleId="880">
     <w:name w:val="toc 6"/>
-    <w:basedOn w:val="664"/>
-    <w:next w:val="664"/>
+    <w:basedOn w:val="887"/>
+    <w:next w:val="887"/>
     <w:uiPriority w:val="39"/>
     <w:unhideWhenUsed/>
     <w:pPr>
@@ -30772,10 +30977,10 @@
       <w:ind w:left="1100"/>
     </w:pPr>
   </w:style>
-  <w:style w:type="paragraph" w:styleId="195">
+  <w:style w:type="paragraph" w:styleId="881">
     <w:name w:val="toc 7"/>
-    <w:basedOn w:val="664"/>
-    <w:next w:val="664"/>
+    <w:basedOn w:val="887"/>
+    <w:next w:val="887"/>
     <w:uiPriority w:val="39"/>
     <w:unhideWhenUsed/>
     <w:pPr>
@@ -30784,10 +30989,10 @@
       <w:ind w:left="1320"/>
     </w:pPr>
   </w:style>
-  <w:style w:type="paragraph" w:styleId="196">
+  <w:style w:type="paragraph" w:styleId="882">
     <w:name w:val="toc 8"/>
-    <w:basedOn w:val="664"/>
-    <w:next w:val="664"/>
+    <w:basedOn w:val="887"/>
+    <w:next w:val="887"/>
     <w:uiPriority w:val="39"/>
     <w:unhideWhenUsed/>
     <w:pPr>
@@ -30796,10 +31001,10 @@
       <w:ind w:left="1540"/>
     </w:pPr>
   </w:style>
-  <w:style w:type="paragraph" w:styleId="197">
+  <w:style w:type="paragraph" w:styleId="883">
     <w:name w:val="toc 9"/>
-    <w:basedOn w:val="664"/>
-    <w:next w:val="664"/>
+    <w:basedOn w:val="887"/>
+    <w:next w:val="887"/>
     <w:uiPriority w:val="39"/>
     <w:unhideWhenUsed/>
     <w:pPr>
@@ -30808,9 +31013,9 @@
       <w:ind w:left="1760"/>
     </w:pPr>
   </w:style>
-  <w:style w:type="character" w:styleId="198">
+  <w:style w:type="character" w:styleId="884">
     <w:name w:val="Placeholder Text"/>
-    <w:basedOn w:val="665"/>
+    <w:basedOn w:val="888"/>
     <w:uiPriority w:val="99"/>
     <w:semiHidden/>
     <w:pPr>
@@ -30822,7 +31027,7 @@
       <w:color w:val="666666"/>
     </w:rPr>
   </w:style>
-  <w:style w:type="paragraph" w:styleId="208">
+  <w:style w:type="paragraph" w:styleId="885">
     <w:name w:val="TOC Heading"/>
     <w:uiPriority w:val="39"/>
     <w:unhideWhenUsed/>
@@ -30832,10 +31037,10 @@
       <w:ind/>
     </w:pPr>
   </w:style>
-  <w:style w:type="paragraph" w:styleId="209">
+  <w:style w:type="paragraph" w:styleId="886">
     <w:name w:val="table of figures"/>
-    <w:basedOn w:val="664"/>
-    <w:next w:val="664"/>
+    <w:basedOn w:val="887"/>
+    <w:next w:val="887"/>
     <w:uiPriority w:val="99"/>
     <w:unhideWhenUsed/>
     <w:pPr>
@@ -30844,7 +31049,7 @@
       <w:ind/>
     </w:pPr>
   </w:style>
-  <w:style w:type="paragraph" w:styleId="664" w:default="1">
+  <w:style w:type="paragraph" w:styleId="887" w:default="1">
     <w:name w:val="Normal"/>
     <w:qFormat/>
     <w:pPr>
@@ -30856,7 +31061,7 @@
       <w:lang w:val="en-GB"/>
     </w:rPr>
   </w:style>
-  <w:style w:type="character" w:styleId="665" w:default="1">
+  <w:style w:type="character" w:styleId="888" w:default="1">
     <w:name w:val="Default Paragraph Font"/>
     <w:uiPriority w:val="1"/>
     <w:semiHidden/>
@@ -30867,7 +31072,7 @@
       <w:ind/>
     </w:pPr>
   </w:style>
-  <w:style w:type="table" w:styleId="666" w:default="1">
+  <w:style w:type="table" w:styleId="889" w:default="1">
     <w:name w:val="Normal Table"/>
     <w:uiPriority w:val="99"/>
     <w:semiHidden/>
@@ -31060,7 +31265,7 @@
       </w:tcPr>
     </w:tblStylePr>
   </w:style>
-  <w:style w:type="numbering" w:styleId="667" w:default="1">
+  <w:style w:type="numbering" w:styleId="890" w:default="1">
     <w:name w:val="No List"/>
     <w:uiPriority w:val="99"/>
     <w:semiHidden/>

</xml_diff>